<commit_message>
Simplificar la sección de métricas clave con lenguaje claro
Co-Authored-By: Claude Opus 5.5 <noreply@anthropic.com>
Claude-Session: https://claude.ai/code/session_01DdHtXnKkH2zWgkQRN2ahpo
</commit_message>
<xml_diff>
--- a/informes/Informe_Ejecutivo_Evertec_Septiembre_2026.docx
+++ b/informes/Informe_Ejecutivo_Evertec_Septiembre_2026.docx
@@ -605,22 +605,10 @@
     </w:p>
     <w:p>
       <w:pPr>
-        <w:pStyle w:val="ListParagraph"/>
-        <w:numPr>
-          <w:ilvl w:val="0"/>
-          <w:numId w:val="2"/>
-        </w:numPr>
-        <w:spacing w:after="80"/>
+        <w:pStyle w:val="Heading2"/>
       </w:pPr>
       <w:r>
-        <w:rPr>
-          <w:b/>
-          <w:bCs/>
-        </w:rPr>
-        <w:t xml:space="preserve">Colaboradores evaluados:</w:t>
-      </w:r>
-      <w:r>
-        <w:t xml:space="preserve"> 17.</w:t>
+        <w:t xml:space="preserve">¿Quiénes participaron?</w:t>
       </w:r>
     </w:p>
     <w:p>
@@ -637,10 +625,10 @@
           <w:b/>
           <w:bCs/>
         </w:rPr>
-        <w:t xml:space="preserve">Encuestas completadas:</w:t>
-      </w:r>
-      <w:r>
-        <w:t xml:space="preserve"> 17 de 17 formularios registrados (100 % de formularios recibidos completados, sin registros incompletos).</w:t>
+        <w:t xml:space="preserve">17 colaboradores</w:t>
+      </w:r>
+      <w:r>
+        <w:t xml:space="preserve"> de Comedica respondieron la encuesta.</w:t>
       </w:r>
     </w:p>
     <w:p>
@@ -653,14 +641,17 @@
         <w:spacing w:after="80"/>
       </w:pPr>
       <w:r>
+        <w:t xml:space="preserve">Participaron </w:t>
+      </w:r>
+      <w:r>
         <w:rPr>
           <w:b/>
           <w:bCs/>
         </w:rPr>
-        <w:t xml:space="preserve">Puntos de atención representados:</w:t>
-      </w:r>
-      <w:r>
-        <w:t xml:space="preserve"> 10 unidades distintas (9 agencias más la jefatura de la Agencia Móvil): San Miguel, Colonia Médica, Sonsonate, Santa Ana, Plaza Mundo, Plaza Merliot, Colegio Médico, Usulután, Central y Jefe Móvil.</w:t>
+        <w:t xml:space="preserve">9 agencias y la Agencia Móvil</w:t>
+      </w:r>
+      <w:r>
+        <w:t xml:space="preserve">: San Miguel, Colonia Médica, Sonsonate, Santa Ana, Plaza Mundo, Plaza Merliot, Colegio Médico, Usulután y Central.</w:t>
       </w:r>
     </w:p>
     <w:p>
@@ -673,14 +664,17 @@
         <w:spacing w:after="80"/>
       </w:pPr>
       <w:r>
+        <w:t xml:space="preserve">Las respuestas se recibieron el </w:t>
+      </w:r>
+      <w:r>
         <w:rPr>
           <w:b/>
           <w:bCs/>
         </w:rPr>
-        <w:t xml:space="preserve">Distribución temporal:</w:t>
-      </w:r>
-      <w:r>
-        <w:t xml:space="preserve"> 7 encuestas el 16/09/2026 y 10 encuestas el 17/09/2026.</w:t>
+        <w:t xml:space="preserve">16 y 17 de septiembre de 2026</w:t>
+      </w:r>
+      <w:r>
+        <w:t xml:space="preserve">.</w:t>
       </w:r>
     </w:p>
     <w:p>
@@ -697,10 +691,521 @@
           <w:b/>
           <w:bCs/>
         </w:rPr>
-        <w:t xml:space="preserve">Calificación general del servicio (columna "En términos generales…"):</w:t>
-      </w:r>
-      <w:r>
-        <w:t xml:space="preserve"> promedio 3.82; 14 respuestas con calificación 4 (82.4 %) y 3 respuestas con calificación 3 (17.6 %).</w:t>
+        <w:t xml:space="preserve">Todas las encuestas recibidas se contestaron completas.</w:t>
+      </w:r>
+    </w:p>
+    <w:p>
+      <w:pPr>
+        <w:pStyle w:val="Heading2"/>
+      </w:pPr>
+      <w:r>
+        <w:t xml:space="preserve">¿Qué opina el personal del servicio de Evertec?</w:t>
+      </w:r>
+    </w:p>
+    <w:tbl>
+      <w:tblPr>
+        <w:tblW w:type="dxa" w:w="9936"/>
+        <w:tblBorders>
+          <w:top w:val="single" w:color="auto" w:sz="4"/>
+          <w:left w:val="single" w:color="auto" w:sz="4"/>
+          <w:bottom w:val="single" w:color="auto" w:sz="4"/>
+          <w:right w:val="single" w:color="auto" w:sz="4"/>
+          <w:insideH w:val="single" w:color="auto" w:sz="4"/>
+          <w:insideV w:val="single" w:color="auto" w:sz="4"/>
+        </w:tblBorders>
+      </w:tblPr>
+      <w:tblGrid>
+        <w:gridCol w:w="3161"/>
+        <w:gridCol w:w="3387"/>
+        <w:gridCol w:w="3388"/>
+      </w:tblGrid>
+      <w:tr>
+        <w:trPr>
+          <w:tblHeader/>
+        </w:trPr>
+        <w:tc>
+          <w:tcPr>
+            <w:tcW w:type="dxa" w:w="3161"/>
+            <w:tcBorders>
+              <w:top w:val="single" w:color="BFBFBF" w:sz="4"/>
+              <w:left w:val="single" w:color="BFBFBF" w:sz="4"/>
+              <w:bottom w:val="single" w:color="BFBFBF" w:sz="4"/>
+              <w:right w:val="single" w:color="BFBFBF" w:sz="4"/>
+            </w:tcBorders>
+            <w:shd w:fill="1F3864" w:color="auto" w:val="clear"/>
+            <w:tcMar>
+              <w:top w:type="dxa" w:w="50"/>
+              <w:left w:type="dxa" w:w="80"/>
+              <w:bottom w:type="dxa" w:w="50"/>
+              <w:right w:type="dxa" w:w="80"/>
+            </w:tcMar>
+          </w:tcPr>
+          <w:p>
+            <w:r>
+              <w:rPr>
+                <w:rFonts w:ascii="Calibri" w:cs="Calibri" w:eastAsia="Calibri" w:hAnsi="Calibri"/>
+                <w:b/>
+                <w:bCs/>
+                <w:color w:val="FFFFFF"/>
+                <w:sz w:val="19"/>
+                <w:szCs w:val="19"/>
+              </w:rPr>
+              <w:t xml:space="preserve">Aspecto evaluado</w:t>
+            </w:r>
+          </w:p>
+        </w:tc>
+        <w:tc>
+          <w:tcPr>
+            <w:tcW w:type="dxa" w:w="3387"/>
+            <w:tcBorders>
+              <w:top w:val="single" w:color="BFBFBF" w:sz="4"/>
+              <w:left w:val="single" w:color="BFBFBF" w:sz="4"/>
+              <w:bottom w:val="single" w:color="BFBFBF" w:sz="4"/>
+              <w:right w:val="single" w:color="BFBFBF" w:sz="4"/>
+            </w:tcBorders>
+            <w:shd w:fill="1F3864" w:color="auto" w:val="clear"/>
+            <w:tcMar>
+              <w:top w:type="dxa" w:w="50"/>
+              <w:left w:type="dxa" w:w="80"/>
+              <w:bottom w:type="dxa" w:w="50"/>
+              <w:right w:type="dxa" w:w="80"/>
+            </w:tcMar>
+          </w:tcPr>
+          <w:p>
+            <w:r>
+              <w:rPr>
+                <w:rFonts w:ascii="Calibri" w:cs="Calibri" w:eastAsia="Calibri" w:hAnsi="Calibri"/>
+                <w:b/>
+                <w:bCs/>
+                <w:color w:val="FFFFFF"/>
+                <w:sz w:val="19"/>
+                <w:szCs w:val="19"/>
+              </w:rPr>
+              <w:t xml:space="preserve">Resultado</w:t>
+            </w:r>
+          </w:p>
+        </w:tc>
+        <w:tc>
+          <w:tcPr>
+            <w:tcW w:type="dxa" w:w="3388"/>
+            <w:tcBorders>
+              <w:top w:val="single" w:color="BFBFBF" w:sz="4"/>
+              <w:left w:val="single" w:color="BFBFBF" w:sz="4"/>
+              <w:bottom w:val="single" w:color="BFBFBF" w:sz="4"/>
+              <w:right w:val="single" w:color="BFBFBF" w:sz="4"/>
+            </w:tcBorders>
+            <w:shd w:fill="1F3864" w:color="auto" w:val="clear"/>
+            <w:tcMar>
+              <w:top w:type="dxa" w:w="50"/>
+              <w:left w:type="dxa" w:w="80"/>
+              <w:bottom w:type="dxa" w:w="50"/>
+              <w:right w:type="dxa" w:w="80"/>
+            </w:tcMar>
+          </w:tcPr>
+          <w:p>
+            <w:r>
+              <w:rPr>
+                <w:rFonts w:ascii="Calibri" w:cs="Calibri" w:eastAsia="Calibri" w:hAnsi="Calibri"/>
+                <w:b/>
+                <w:bCs/>
+                <w:color w:val="FFFFFF"/>
+                <w:sz w:val="19"/>
+                <w:szCs w:val="19"/>
+              </w:rPr>
+              <w:t xml:space="preserve">¿Qué significa para Comedica?</w:t>
+            </w:r>
+          </w:p>
+        </w:tc>
+      </w:tr>
+      <w:tr>
+        <w:trPr>
+          <w:tblHeader w:val="false"/>
+        </w:trPr>
+        <w:tc>
+          <w:tcPr>
+            <w:tcW w:type="dxa" w:w="3161"/>
+            <w:tcBorders>
+              <w:top w:val="single" w:color="BFBFBF" w:sz="4"/>
+              <w:left w:val="single" w:color="BFBFBF" w:sz="4"/>
+              <w:bottom w:val="single" w:color="BFBFBF" w:sz="4"/>
+              <w:right w:val="single" w:color="BFBFBF" w:sz="4"/>
+            </w:tcBorders>
+            <w:shd w:fill="FFFFFF" w:color="auto" w:val="clear"/>
+            <w:tcMar>
+              <w:top w:type="dxa" w:w="50"/>
+              <w:left w:type="dxa" w:w="80"/>
+              <w:bottom w:type="dxa" w:w="50"/>
+              <w:right w:type="dxa" w:w="80"/>
+            </w:tcMar>
+          </w:tcPr>
+          <w:p>
+            <w:r>
+              <w:rPr>
+                <w:rFonts w:ascii="Calibri" w:cs="Calibri" w:eastAsia="Calibri" w:hAnsi="Calibri"/>
+                <w:color w:val="000000"/>
+                <w:sz w:val="19"/>
+                <w:szCs w:val="19"/>
+              </w:rPr>
+              <w:t xml:space="preserve">Nota general del servicio</w:t>
+            </w:r>
+          </w:p>
+        </w:tc>
+        <w:tc>
+          <w:tcPr>
+            <w:tcW w:type="dxa" w:w="3387"/>
+            <w:tcBorders>
+              <w:top w:val="single" w:color="BFBFBF" w:sz="4"/>
+              <w:left w:val="single" w:color="BFBFBF" w:sz="4"/>
+              <w:bottom w:val="single" w:color="BFBFBF" w:sz="4"/>
+              <w:right w:val="single" w:color="BFBFBF" w:sz="4"/>
+            </w:tcBorders>
+            <w:shd w:fill="FFFFFF" w:color="auto" w:val="clear"/>
+            <w:tcMar>
+              <w:top w:type="dxa" w:w="50"/>
+              <w:left w:type="dxa" w:w="80"/>
+              <w:bottom w:type="dxa" w:w="50"/>
+              <w:right w:type="dxa" w:w="80"/>
+            </w:tcMar>
+          </w:tcPr>
+          <w:p>
+            <w:r>
+              <w:rPr>
+                <w:rFonts w:ascii="Calibri" w:cs="Calibri" w:eastAsia="Calibri" w:hAnsi="Calibri"/>
+                <w:color w:val="000000"/>
+                <w:sz w:val="19"/>
+                <w:szCs w:val="19"/>
+              </w:rPr>
+              <w:t xml:space="preserve">14 de 17 colaboradores le dieron nota de 4; los otros 3 le dieron nota de 3. Nadie le dio una nota menor.</w:t>
+            </w:r>
+          </w:p>
+        </w:tc>
+        <w:tc>
+          <w:tcPr>
+            <w:tcW w:type="dxa" w:w="3388"/>
+            <w:tcBorders>
+              <w:top w:val="single" w:color="BFBFBF" w:sz="4"/>
+              <w:left w:val="single" w:color="BFBFBF" w:sz="4"/>
+              <w:bottom w:val="single" w:color="BFBFBF" w:sz="4"/>
+              <w:right w:val="single" w:color="BFBFBF" w:sz="4"/>
+            </w:tcBorders>
+            <w:shd w:fill="FFFFFF" w:color="auto" w:val="clear"/>
+            <w:tcMar>
+              <w:top w:type="dxa" w:w="50"/>
+              <w:left w:type="dxa" w:w="80"/>
+              <w:bottom w:type="dxa" w:w="50"/>
+              <w:right w:type="dxa" w:w="80"/>
+            </w:tcMar>
+          </w:tcPr>
+          <w:p>
+            <w:r>
+              <w:rPr>
+                <w:rFonts w:ascii="Calibri" w:cs="Calibri" w:eastAsia="Calibri" w:hAnsi="Calibri"/>
+                <w:color w:val="000000"/>
+                <w:sz w:val="19"/>
+                <w:szCs w:val="19"/>
+              </w:rPr>
+              <w:t xml:space="preserve">El personal está conforme con el servicio, pero todavía hay aspectos por mejorar.</w:t>
+            </w:r>
+          </w:p>
+        </w:tc>
+      </w:tr>
+      <w:tr>
+        <w:trPr>
+          <w:tblHeader w:val="false"/>
+        </w:trPr>
+        <w:tc>
+          <w:tcPr>
+            <w:tcW w:type="dxa" w:w="3161"/>
+            <w:tcBorders>
+              <w:top w:val="single" w:color="BFBFBF" w:sz="4"/>
+              <w:left w:val="single" w:color="BFBFBF" w:sz="4"/>
+              <w:bottom w:val="single" w:color="BFBFBF" w:sz="4"/>
+              <w:right w:val="single" w:color="BFBFBF" w:sz="4"/>
+            </w:tcBorders>
+            <w:shd w:fill="EAF1FB" w:color="auto" w:val="clear"/>
+            <w:tcMar>
+              <w:top w:type="dxa" w:w="50"/>
+              <w:left w:type="dxa" w:w="80"/>
+              <w:bottom w:type="dxa" w:w="50"/>
+              <w:right w:type="dxa" w:w="80"/>
+            </w:tcMar>
+          </w:tcPr>
+          <w:p>
+            <w:r>
+              <w:rPr>
+                <w:rFonts w:ascii="Calibri" w:cs="Calibri" w:eastAsia="Calibri" w:hAnsi="Calibri"/>
+                <w:color w:val="000000"/>
+                <w:sz w:val="19"/>
+                <w:szCs w:val="19"/>
+              </w:rPr>
+              <w:t xml:space="preserve">Rapidez de la atención</w:t>
+            </w:r>
+          </w:p>
+        </w:tc>
+        <w:tc>
+          <w:tcPr>
+            <w:tcW w:type="dxa" w:w="3387"/>
+            <w:tcBorders>
+              <w:top w:val="single" w:color="BFBFBF" w:sz="4"/>
+              <w:left w:val="single" w:color="BFBFBF" w:sz="4"/>
+              <w:bottom w:val="single" w:color="BFBFBF" w:sz="4"/>
+              <w:right w:val="single" w:color="BFBFBF" w:sz="4"/>
+            </w:tcBorders>
+            <w:shd w:fill="EAF1FB" w:color="auto" w:val="clear"/>
+            <w:tcMar>
+              <w:top w:type="dxa" w:w="50"/>
+              <w:left w:type="dxa" w:w="80"/>
+              <w:bottom w:type="dxa" w:w="50"/>
+              <w:right w:type="dxa" w:w="80"/>
+            </w:tcMar>
+          </w:tcPr>
+          <w:p>
+            <w:r>
+              <w:rPr>
+                <w:rFonts w:ascii="Calibri" w:cs="Calibri" w:eastAsia="Calibri" w:hAnsi="Calibri"/>
+                <w:color w:val="000000"/>
+                <w:sz w:val="19"/>
+                <w:szCs w:val="19"/>
+              </w:rPr>
+              <w:t xml:space="preserve">15 de 17 dicen que Evertec los atiende a tiempo; solo 2 dicen que la atención es regular.</w:t>
+            </w:r>
+          </w:p>
+        </w:tc>
+        <w:tc>
+          <w:tcPr>
+            <w:tcW w:type="dxa" w:w="3388"/>
+            <w:tcBorders>
+              <w:top w:val="single" w:color="BFBFBF" w:sz="4"/>
+              <w:left w:val="single" w:color="BFBFBF" w:sz="4"/>
+              <w:bottom w:val="single" w:color="BFBFBF" w:sz="4"/>
+              <w:right w:val="single" w:color="BFBFBF" w:sz="4"/>
+            </w:tcBorders>
+            <w:shd w:fill="EAF1FB" w:color="auto" w:val="clear"/>
+            <w:tcMar>
+              <w:top w:type="dxa" w:w="50"/>
+              <w:left w:type="dxa" w:w="80"/>
+              <w:bottom w:type="dxa" w:w="50"/>
+              <w:right w:type="dxa" w:w="80"/>
+            </w:tcMar>
+          </w:tcPr>
+          <w:p>
+            <w:r>
+              <w:rPr>
+                <w:rFonts w:ascii="Calibri" w:cs="Calibri" w:eastAsia="Calibri" w:hAnsi="Calibri"/>
+                <w:color w:val="000000"/>
+                <w:sz w:val="19"/>
+                <w:szCs w:val="19"/>
+              </w:rPr>
+              <w:t xml:space="preserve">Cuando se reporta un problema, Evertec responde a tiempo.</w:t>
+            </w:r>
+          </w:p>
+        </w:tc>
+      </w:tr>
+      <w:tr>
+        <w:trPr>
+          <w:tblHeader w:val="false"/>
+        </w:trPr>
+        <w:tc>
+          <w:tcPr>
+            <w:tcW w:type="dxa" w:w="3161"/>
+            <w:tcBorders>
+              <w:top w:val="single" w:color="BFBFBF" w:sz="4"/>
+              <w:left w:val="single" w:color="BFBFBF" w:sz="4"/>
+              <w:bottom w:val="single" w:color="BFBFBF" w:sz="4"/>
+              <w:right w:val="single" w:color="BFBFBF" w:sz="4"/>
+            </w:tcBorders>
+            <w:shd w:fill="FFFFFF" w:color="auto" w:val="clear"/>
+            <w:tcMar>
+              <w:top w:type="dxa" w:w="50"/>
+              <w:left w:type="dxa" w:w="80"/>
+              <w:bottom w:type="dxa" w:w="50"/>
+              <w:right w:type="dxa" w:w="80"/>
+            </w:tcMar>
+          </w:tcPr>
+          <w:p>
+            <w:r>
+              <w:rPr>
+                <w:rFonts w:ascii="Calibri" w:cs="Calibri" w:eastAsia="Calibri" w:hAnsi="Calibri"/>
+                <w:color w:val="000000"/>
+                <w:sz w:val="19"/>
+                <w:szCs w:val="19"/>
+              </w:rPr>
+              <w:t xml:space="preserve">Facilidad para resolver los problemas</w:t>
+            </w:r>
+          </w:p>
+        </w:tc>
+        <w:tc>
+          <w:tcPr>
+            <w:tcW w:type="dxa" w:w="3387"/>
+            <w:tcBorders>
+              <w:top w:val="single" w:color="BFBFBF" w:sz="4"/>
+              <w:left w:val="single" w:color="BFBFBF" w:sz="4"/>
+              <w:bottom w:val="single" w:color="BFBFBF" w:sz="4"/>
+              <w:right w:val="single" w:color="BFBFBF" w:sz="4"/>
+            </w:tcBorders>
+            <w:shd w:fill="FFFFFF" w:color="auto" w:val="clear"/>
+            <w:tcMar>
+              <w:top w:type="dxa" w:w="50"/>
+              <w:left w:type="dxa" w:w="80"/>
+              <w:bottom w:type="dxa" w:w="50"/>
+              <w:right w:type="dxa" w:w="80"/>
+            </w:tcMar>
+          </w:tcPr>
+          <w:p>
+            <w:r>
+              <w:rPr>
+                <w:rFonts w:ascii="Calibri" w:cs="Calibri" w:eastAsia="Calibri" w:hAnsi="Calibri"/>
+                <w:color w:val="000000"/>
+                <w:sz w:val="19"/>
+                <w:szCs w:val="19"/>
+              </w:rPr>
+              <w:t xml:space="preserve">8 de 17 dicen que es fácil o muy fácil; 8 dicen que es regular y 1 dice que es difícil.</w:t>
+            </w:r>
+          </w:p>
+        </w:tc>
+        <w:tc>
+          <w:tcPr>
+            <w:tcW w:type="dxa" w:w="3388"/>
+            <w:tcBorders>
+              <w:top w:val="single" w:color="BFBFBF" w:sz="4"/>
+              <w:left w:val="single" w:color="BFBFBF" w:sz="4"/>
+              <w:bottom w:val="single" w:color="BFBFBF" w:sz="4"/>
+              <w:right w:val="single" w:color="BFBFBF" w:sz="4"/>
+            </w:tcBorders>
+            <w:shd w:fill="FFFFFF" w:color="auto" w:val="clear"/>
+            <w:tcMar>
+              <w:top w:type="dxa" w:w="50"/>
+              <w:left w:type="dxa" w:w="80"/>
+              <w:bottom w:type="dxa" w:w="50"/>
+              <w:right w:type="dxa" w:w="80"/>
+            </w:tcMar>
+          </w:tcPr>
+          <w:p>
+            <w:r>
+              <w:rPr>
+                <w:rFonts w:ascii="Calibri" w:cs="Calibri" w:eastAsia="Calibri" w:hAnsi="Calibri"/>
+                <w:color w:val="000000"/>
+                <w:sz w:val="19"/>
+                <w:szCs w:val="19"/>
+              </w:rPr>
+              <w:t xml:space="preserve">Evertec atiende rápido, pero a más de la mitad del personal le cuesta que el problema quede resuelto. </w:t>
+            </w:r>
+            <w:r>
+              <w:rPr>
+                <w:rFonts w:ascii="Calibri" w:cs="Calibri" w:eastAsia="Calibri" w:hAnsi="Calibri"/>
+                <w:color w:val="000000"/>
+                <w:sz w:val="19"/>
+                <w:szCs w:val="19"/>
+              </w:rPr>
+              <w:t xml:space="preserve">Es el punto más débil.</w:t>
+            </w:r>
+          </w:p>
+        </w:tc>
+      </w:tr>
+      <w:tr>
+        <w:trPr>
+          <w:tblHeader w:val="false"/>
+        </w:trPr>
+        <w:tc>
+          <w:tcPr>
+            <w:tcW w:type="dxa" w:w="3161"/>
+            <w:tcBorders>
+              <w:top w:val="single" w:color="BFBFBF" w:sz="4"/>
+              <w:left w:val="single" w:color="BFBFBF" w:sz="4"/>
+              <w:bottom w:val="single" w:color="BFBFBF" w:sz="4"/>
+              <w:right w:val="single" w:color="BFBFBF" w:sz="4"/>
+            </w:tcBorders>
+            <w:shd w:fill="EAF1FB" w:color="auto" w:val="clear"/>
+            <w:tcMar>
+              <w:top w:type="dxa" w:w="50"/>
+              <w:left w:type="dxa" w:w="80"/>
+              <w:bottom w:type="dxa" w:w="50"/>
+              <w:right w:type="dxa" w:w="80"/>
+            </w:tcMar>
+          </w:tcPr>
+          <w:p>
+            <w:r>
+              <w:rPr>
+                <w:rFonts w:ascii="Calibri" w:cs="Calibri" w:eastAsia="Calibri" w:hAnsi="Calibri"/>
+                <w:color w:val="000000"/>
+                <w:sz w:val="19"/>
+                <w:szCs w:val="19"/>
+              </w:rPr>
+              <w:t xml:space="preserve">Qué tan seguido se presentan problemas</w:t>
+            </w:r>
+          </w:p>
+        </w:tc>
+        <w:tc>
+          <w:tcPr>
+            <w:tcW w:type="dxa" w:w="3387"/>
+            <w:tcBorders>
+              <w:top w:val="single" w:color="BFBFBF" w:sz="4"/>
+              <w:left w:val="single" w:color="BFBFBF" w:sz="4"/>
+              <w:bottom w:val="single" w:color="BFBFBF" w:sz="4"/>
+              <w:right w:val="single" w:color="BFBFBF" w:sz="4"/>
+            </w:tcBorders>
+            <w:shd w:fill="EAF1FB" w:color="auto" w:val="clear"/>
+            <w:tcMar>
+              <w:top w:type="dxa" w:w="50"/>
+              <w:left w:type="dxa" w:w="80"/>
+              <w:bottom w:type="dxa" w:w="50"/>
+              <w:right w:type="dxa" w:w="80"/>
+            </w:tcMar>
+          </w:tcPr>
+          <w:p>
+            <w:r>
+              <w:rPr>
+                <w:rFonts w:ascii="Calibri" w:cs="Calibri" w:eastAsia="Calibri" w:hAnsi="Calibri"/>
+                <w:color w:val="000000"/>
+                <w:sz w:val="19"/>
+                <w:szCs w:val="19"/>
+              </w:rPr>
+              <w:t xml:space="preserve">7 de 17 dicen que pasa con frecuencia; 5 dicen que a veces y 5 que casi nunca.</w:t>
+            </w:r>
+          </w:p>
+        </w:tc>
+        <w:tc>
+          <w:tcPr>
+            <w:tcW w:type="dxa" w:w="3388"/>
+            <w:tcBorders>
+              <w:top w:val="single" w:color="BFBFBF" w:sz="4"/>
+              <w:left w:val="single" w:color="BFBFBF" w:sz="4"/>
+              <w:bottom w:val="single" w:color="BFBFBF" w:sz="4"/>
+              <w:right w:val="single" w:color="BFBFBF" w:sz="4"/>
+            </w:tcBorders>
+            <w:shd w:fill="EAF1FB" w:color="auto" w:val="clear"/>
+            <w:tcMar>
+              <w:top w:type="dxa" w:w="50"/>
+              <w:left w:type="dxa" w:w="80"/>
+              <w:bottom w:type="dxa" w:w="50"/>
+              <w:right w:type="dxa" w:w="80"/>
+            </w:tcMar>
+          </w:tcPr>
+          <w:p>
+            <w:r>
+              <w:rPr>
+                <w:rFonts w:ascii="Calibri" w:cs="Calibri" w:eastAsia="Calibri" w:hAnsi="Calibri"/>
+                <w:color w:val="000000"/>
+                <w:sz w:val="19"/>
+                <w:szCs w:val="19"/>
+              </w:rPr>
+              <w:t xml:space="preserve">Casi la mitad del personal enfrenta problemas con frecuencia, lo que afecta la atención a los asociados en ventanilla.</w:t>
+            </w:r>
+          </w:p>
+        </w:tc>
+      </w:tr>
+    </w:tbl>
+    <w:p>
+      <w:pPr>
+        <w:spacing w:after="80"/>
+      </w:pPr>
+    </w:p>
+    <w:p>
+      <w:pPr>
+        <w:pStyle w:val="Heading2"/>
+      </w:pPr>
+      <w:r>
+        <w:t xml:space="preserve">En pocas palabras</w:t>
       </w:r>
     </w:p>
     <w:p>
@@ -717,10 +1222,10 @@
           <w:b/>
           <w:bCs/>
         </w:rPr>
-        <w:t xml:space="preserve">Facilidad de resolución (columna "¿Qué tan fácil resulta…"):</w:t>
-      </w:r>
-      <w:r>
-        <w:t xml:space="preserve"> Muy fácil 1 (5.9 %), Fácil 7 (41.2 %), Regular 8 (47.1 %), Difícil 1 (5.9 %). El 52.9 % no percibe la resolución como fácil.</w:t>
+        <w:t xml:space="preserve">Lo bueno:</w:t>
+      </w:r>
+      <w:r>
+        <w:t xml:space="preserve"> el servicio funciona y Evertec atiende a tiempo cuando se le reporta un problema.</w:t>
       </w:r>
     </w:p>
     <w:p>
@@ -737,10 +1242,10 @@
           <w:b/>
           <w:bCs/>
         </w:rPr>
-        <w:t xml:space="preserve">Oportunidad de atención (columna "Cuando se presenta…"):</w:t>
-      </w:r>
-      <w:r>
-        <w:t xml:space="preserve"> Muy oportunamente 2 (11.8 %), Oportunamente 13 (76.5 %), Regular 2 (11.8 %).</w:t>
+        <w:t xml:space="preserve">Lo que hay que mejorar:</w:t>
+      </w:r>
+      <w:r>
+        <w:t xml:space="preserve"> que los problemas se resuelvan a la primera y que se presenten con menos frecuencia.</w:t>
       </w:r>
     </w:p>
     <w:p>
@@ -757,69 +1262,10 @@
           <w:b/>
           <w:bCs/>
         </w:rPr>
-        <w:t xml:space="preserve">Frecuencia de incidencias (columna I, "¿Con qué frecuencia…"):</w:t>
-      </w:r>
-      <w:r>
-        <w:t xml:space="preserve"> Frecuentemente 7 (41.2 %), Algunas veces 5 (29.4 %), Rara vez 5 (29.4 %).</w:t>
-      </w:r>
-    </w:p>
-    <w:p>
-      <w:pPr>
-        <w:pStyle w:val="ListParagraph"/>
-        <w:numPr>
-          <w:ilvl w:val="0"/>
-          <w:numId w:val="2"/>
-        </w:numPr>
-        <w:spacing w:after="80"/>
-      </w:pPr>
-      <w:r>
-        <w:rPr>
-          <w:b/>
-          <w:bCs/>
-        </w:rPr>
-        <w:t xml:space="preserve">Frecuencia de uso/contacto (columna G, "¿Con qué frecuencia…"):</w:t>
-      </w:r>
-      <w:r>
-        <w:t xml:space="preserve"> Frecuentemente 6 (35.3 %), Algunas veces 9 (52.9 %), Rara vez 2 (11.8 %).</w:t>
-      </w:r>
-    </w:p>
-    <w:p>
-      <w:pPr>
-        <w:pStyle w:val="ListParagraph"/>
-        <w:numPr>
-          <w:ilvl w:val="0"/>
-          <w:numId w:val="2"/>
-        </w:numPr>
-        <w:spacing w:after="80"/>
-      </w:pPr>
-      <w:r>
-        <w:rPr>
-          <w:b/>
-          <w:bCs/>
-        </w:rPr>
-        <w:t xml:space="preserve">Tiempo de llenado de la encuesta:</w:t>
-      </w:r>
-      <w:r>
-        <w:t xml:space="preserve"> mediana de 5 min 58 s; promedio de 8 min 01 s (influido por un registro de 41 min 57 s).</w:t>
-      </w:r>
-    </w:p>
-    <w:p>
-      <w:pPr>
-        <w:pBdr>
-          <w:left w:val="single" w:color="2E75B6" w:sz="12" w:space="8"/>
-        </w:pBdr>
-        <w:spacing w:after="160"/>
-        <w:ind w:left="360"/>
-      </w:pPr>
-      <w:r>
-        <w:rPr>
-          <w:i/>
-          <w:iCs/>
-          <w:color w:val="595959"/>
-          <w:sz w:val="18"/>
-          <w:szCs w:val="18"/>
-        </w:rPr>
-        <w:t xml:space="preserve">Nota metodológica: los encabezados de las columnas G a L aparecen truncados en la captura de pantalla; las etiquetas se citan según el texto visible.</w:t>
+        <w:t xml:space="preserve">Los problemas más mencionados:</w:t>
+      </w:r>
+      <w:r>
+        <w:t xml:space="preserve"> caídas y lentitud del sistema, reversas que no se aplican, tarjetas (plásticos) que fallan, y la atención de reclamos y fraudes.</w:t>
       </w:r>
     </w:p>
     <w:p>

</xml_diff>

<commit_message>
Quitar plan de acción y solicitudes; dejar solo el informe de resultados
Co-Authored-By: Claude Opus 5.5 <noreply@anthropic.com>
Claude-Session: https://claude.ai/code/session_01DdHtXnKkH2zWgkQRN2ahpo
</commit_message>
<xml_diff>
--- a/informes/Informe_Ejecutivo_Evertec_Septiembre_2026.docx
+++ b/informes/Informe_Ejecutivo_Evertec_Septiembre_2026.docx
@@ -29,7 +29,7 @@
           <w:sz w:val="28"/>
           <w:szCs w:val="28"/>
         </w:rPr>
-        <w:t xml:space="preserve">Evaluación del Servicio de Procesamiento de Tarjetas de Crédito (Evertec) y Solicitud de Plan de Acción</w:t>
+        <w:t xml:space="preserve">Evaluación del Servicio de Procesamiento de Tarjetas de Crédito (Evertec)</w:t>
       </w:r>
     </w:p>
     <w:tbl>
@@ -270,7 +270,7 @@
                 <w:sz w:val="19"/>
                 <w:szCs w:val="19"/>
               </w:rPr>
-              <w:t xml:space="preserve">Dirigido a</w:t>
+              <w:t xml:space="preserve">Elaborado por</w:t>
             </w:r>
           </w:p>
         </w:tc>
@@ -299,7 +299,7 @@
                 <w:sz w:val="19"/>
                 <w:szCs w:val="19"/>
               </w:rPr>
-              <w:t xml:space="preserve">[Nombre], [Cargo] – Evertec · Equipo directivo – Comedica</w:t>
+              <w:t xml:space="preserve">[Nombre], [Cargo] – Comedica</w:t>
             </w:r>
           </w:p>
         </w:tc>
@@ -333,7 +333,7 @@
                 <w:sz w:val="19"/>
                 <w:szCs w:val="19"/>
               </w:rPr>
-              <w:t xml:space="preserve">Elaborado por</w:t>
+              <w:t xml:space="preserve">Período de evaluación</w:t>
             </w:r>
           </w:p>
         </w:tc>
@@ -362,7 +362,7 @@
                 <w:sz w:val="19"/>
                 <w:szCs w:val="19"/>
               </w:rPr>
-              <w:t xml:space="preserve">[Nombre], [Cargo] – Comedica</w:t>
+              <w:t xml:space="preserve">Septiembre de 2026 (encuestas del 16 y 17 de septiembre de 2026)</w:t>
             </w:r>
           </w:p>
         </w:tc>
@@ -396,7 +396,7 @@
                 <w:sz w:val="19"/>
                 <w:szCs w:val="19"/>
               </w:rPr>
-              <w:t xml:space="preserve">Período de evaluación</w:t>
+              <w:t xml:space="preserve">Ámbito</w:t>
             </w:r>
           </w:p>
         </w:tc>
@@ -425,7 +425,7 @@
                 <w:sz w:val="19"/>
                 <w:szCs w:val="19"/>
               </w:rPr>
-              <w:t xml:space="preserve">Septiembre de 2026 (encuestas del 16 y 17 de septiembre de 2026)</w:t>
+              <w:t xml:space="preserve">Agencias de Comedica a nivel nacional</w:t>
             </w:r>
           </w:p>
         </w:tc>
@@ -459,7 +459,7 @@
                 <w:sz w:val="19"/>
                 <w:szCs w:val="19"/>
               </w:rPr>
-              <w:t xml:space="preserve">Ámbito</w:t>
+              <w:t xml:space="preserve">Total de registros analizados</w:t>
             </w:r>
           </w:p>
         </w:tc>
@@ -488,7 +488,7 @@
                 <w:sz w:val="19"/>
                 <w:szCs w:val="19"/>
               </w:rPr>
-              <w:t xml:space="preserve">Agencias de Comedica a nivel nacional</w:t>
+              <w:t xml:space="preserve">17 encuestas</w:t>
             </w:r>
           </w:p>
         </w:tc>
@@ -522,7 +522,7 @@
                 <w:sz w:val="19"/>
                 <w:szCs w:val="19"/>
               </w:rPr>
-              <w:t xml:space="preserve">Total de registros analizados</w:t>
+              <w:t xml:space="preserve">Fecha del informe</w:t>
             </w:r>
           </w:p>
         </w:tc>
@@ -536,69 +536,6 @@
               <w:right w:val="single" w:color="BFBFBF" w:sz="4"/>
             </w:tcBorders>
             <w:shd w:fill="FFFFFF" w:color="auto" w:val="clear"/>
-            <w:tcMar>
-              <w:top w:type="dxa" w:w="50"/>
-              <w:left w:type="dxa" w:w="80"/>
-              <w:bottom w:type="dxa" w:w="50"/>
-              <w:right w:type="dxa" w:w="80"/>
-            </w:tcMar>
-          </w:tcPr>
-          <w:p>
-            <w:r>
-              <w:rPr>
-                <w:rFonts w:ascii="Calibri" w:cs="Calibri" w:eastAsia="Calibri" w:hAnsi="Calibri"/>
-                <w:color w:val="000000"/>
-                <w:sz w:val="19"/>
-                <w:szCs w:val="19"/>
-              </w:rPr>
-              <w:t xml:space="preserve">17 encuestas</w:t>
-            </w:r>
-          </w:p>
-        </w:tc>
-      </w:tr>
-      <w:tr>
-        <w:trPr>
-          <w:tblHeader w:val="false"/>
-        </w:trPr>
-        <w:tc>
-          <w:tcPr>
-            <w:tcW w:type="dxa" w:w="4203"/>
-            <w:tcBorders>
-              <w:top w:val="single" w:color="BFBFBF" w:sz="4"/>
-              <w:left w:val="single" w:color="BFBFBF" w:sz="4"/>
-              <w:bottom w:val="single" w:color="BFBFBF" w:sz="4"/>
-              <w:right w:val="single" w:color="BFBFBF" w:sz="4"/>
-            </w:tcBorders>
-            <w:shd w:fill="EAF1FB" w:color="auto" w:val="clear"/>
-            <w:tcMar>
-              <w:top w:type="dxa" w:w="50"/>
-              <w:left w:type="dxa" w:w="80"/>
-              <w:bottom w:type="dxa" w:w="50"/>
-              <w:right w:type="dxa" w:w="80"/>
-            </w:tcMar>
-          </w:tcPr>
-          <w:p>
-            <w:r>
-              <w:rPr>
-                <w:rFonts w:ascii="Calibri" w:cs="Calibri" w:eastAsia="Calibri" w:hAnsi="Calibri"/>
-                <w:color w:val="000000"/>
-                <w:sz w:val="19"/>
-                <w:szCs w:val="19"/>
-              </w:rPr>
-              <w:t xml:space="preserve">Fecha del informe</w:t>
-            </w:r>
-          </w:p>
-        </w:tc>
-        <w:tc>
-          <w:tcPr>
-            <w:tcW w:type="dxa" w:w="5733"/>
-            <w:tcBorders>
-              <w:top w:val="single" w:color="BFBFBF" w:sz="4"/>
-              <w:left w:val="single" w:color="BFBFBF" w:sz="4"/>
-              <w:bottom w:val="single" w:color="BFBFBF" w:sz="4"/>
-              <w:right w:val="single" w:color="BFBFBF" w:sz="4"/>
-            </w:tcBorders>
-            <w:shd w:fill="EAF1FB" w:color="auto" w:val="clear"/>
             <w:tcMar>
               <w:top w:type="dxa" w:w="50"/>
               <w:left w:type="dxa" w:w="80"/>
@@ -647,7 +584,7 @@
         <w:jc w:val="both"/>
       </w:pPr>
       <w:r>
-        <w:t xml:space="preserve">El presente informe presenta los resultados de la Encuesta de Evaluación del Servicio de Procesamiento de Tarjetas de Crédito (Evertec), contestada el 16 y 17 de septiembre de 2026 por 17 colaboradores de Comedica de las agencias San Miguel, Colonia Médica, Sonsonate, Santa Ana, Plaza Mundo, Plaza Merliot, Colegio Médico, Usulután, Central y Jefe Móvil. En la calificación general del servicio, 14 colaboradores asignaron nota de 4 y 3 colaboradores nota de 3. Sin embargo, 9 de los 17 colaboradores consideran que resolver los casos es "Regular" o "Difícil", y 14 de los 17 reportaron problemas que deben corregirse: fallas y lentitud del sistema, reversas no aceptadas, plásticos que no funcionan, abonos registrados como "Nota de Crédito" sin detalle, y la atención de fraudes, contracargos y promociones. Con base en estos resultados, Comedica solicita formalmente a Evertec un plan de acción con fechas compromiso, y presenta al equipo directivo los puntos que corresponden a la institución.</w:t>
+        <w:t xml:space="preserve">El presente informe presenta los resultados de la Encuesta de Evaluación del Servicio de Procesamiento de Tarjetas de Crédito (Evertec), contestada el 16 y 17 de septiembre de 2026 por 17 colaboradores de Comedica de las agencias San Miguel, Colonia Médica, Sonsonate, Santa Ana, Plaza Mundo, Plaza Merliot, Colegio Médico, Usulután, Central y Jefe Móvil. En la calificación general del servicio, 14 colaboradores asignaron nota de 4 y 3 colaboradores nota de 3. Sin embargo, 9 de los 17 colaboradores consideran que resolver los casos es "Regular" o "Difícil", y 14 de los 17 reportaron problemas que deben corregirse: fallas y lentitud del sistema, reversas no aceptadas, plásticos que no funcionan, abonos registrados como "Nota de Crédito" sin detalle, y la atención de fraudes, contracargos y promociones.</w:t>
       </w:r>
     </w:p>
     <w:p>
@@ -5780,7 +5717,7 @@
         <w:pStyle w:val="Heading1"/>
       </w:pPr>
       <w:r>
-        <w:t xml:space="preserve">4. PROBLEMAS REPORTADOS Y SOLICITUDES A EVERTEC</w:t>
+        <w:t xml:space="preserve">4. PROBLEMAS REPORTADOS POR LOS COLABORADORES</w:t>
       </w:r>
     </w:p>
     <w:p>
@@ -5789,7 +5726,7 @@
         <w:jc w:val="both"/>
       </w:pPr>
       <w:r>
-        <w:t xml:space="preserve">De los 17 colaboradores, 14 reportaron problemas y 3 indicaron no tener inconvenientes ("Todo bien", "sin inconvenientes" y "siempre recibo ayuda"). A continuación se presentan los cinco puntos críticos, citando lo que escribieron los colaboradores y lo que Comedica solicita a Evertec para cada uno.</w:t>
+        <w:t xml:space="preserve">De los 17 colaboradores, 14 reportaron problemas y 3 indicaron no tener inconvenientes ("Todo bien", "sin inconvenientes" y "siempre recibo ayuda"). A continuación se presentan los problemas reportados, agrupados por tema y citando lo que escribieron los colaboradores.</w:t>
       </w:r>
     </w:p>
     <w:p>
@@ -5798,19 +5735,6 @@
       </w:pPr>
       <w:r>
         <w:t xml:space="preserve">4.1 Estabilidad y rendimiento de la plataforma</w:t>
-      </w:r>
-    </w:p>
-    <w:p>
-      <w:pPr>
-        <w:spacing w:after="160"/>
-        <w:jc w:val="both"/>
-      </w:pPr>
-      <w:r>
-        <w:rPr>
-          <w:b/>
-          <w:bCs/>
-        </w:rPr>
-        <w:t xml:space="preserve">Lo reportado en la encuesta:</w:t>
       </w:r>
     </w:p>
     <w:p>
@@ -5880,15 +5804,10 @@
     </w:p>
     <w:p>
       <w:pPr>
-        <w:spacing w:after="160"/>
-        <w:jc w:val="both"/>
+        <w:pStyle w:val="Heading2"/>
       </w:pPr>
       <w:r>
-        <w:rPr>
-          <w:b/>
-          <w:bCs/>
-        </w:rPr>
-        <w:t xml:space="preserve">Solicitamos:</w:t>
+        <w:t xml:space="preserve">4.2 Procesamiento de reversas</w:t>
       </w:r>
     </w:p>
     <w:p>
@@ -5901,7 +5820,7 @@
         <w:spacing w:after="80"/>
       </w:pPr>
       <w:r>
-        <w:t xml:space="preserve">Identificar la causa de las fallas de conexión, las caídas y la lentitud del sistema.</w:t>
+        <w:t xml:space="preserve">"La comunicación con la plataforma de Evertec principalmente al monto de reversas porque en ocasiones no las acepta Evertec…".</w:t>
       </w:r>
     </w:p>
     <w:p>
@@ -5914,7 +5833,7 @@
         <w:spacing w:after="80"/>
       </w:pPr>
       <w:r>
-        <w:t xml:space="preserve">Presentar un plan para resolverlas, con responsables y fechas.</w:t>
+        <w:t xml:space="preserve">"Las reversas de transacción".</w:t>
       </w:r>
     </w:p>
     <w:p>
@@ -5927,7 +5846,15 @@
         <w:spacing w:after="80"/>
       </w:pPr>
       <w:r>
-        <w:t xml:space="preserve">Reportar el cumplimiento de los niveles de servicio (SLA) acordados, incluyendo el tiempo de solución de las caídas.</w:t>
+        <w:t xml:space="preserve">"Las duplicidades en los pagos cuando hay caídas de sistemas: en Siscard lo toma y en sistema de Comedica no aparece procesado".</w:t>
+      </w:r>
+    </w:p>
+    <w:p>
+      <w:pPr>
+        <w:pStyle w:val="Heading2"/>
+      </w:pPr>
+      <w:r>
+        <w:t xml:space="preserve">4.3 Calidad de los plásticos y tiempos de reposición</w:t>
       </w:r>
     </w:p>
     <w:p>
@@ -5940,28 +5867,7 @@
         <w:spacing w:after="80"/>
       </w:pPr>
       <w:r>
-        <w:t xml:space="preserve">Mejorar los tiempos de respuesta en fechas de pago y en la aplicación de compras en flotantes de tarjeta de crédito y débito.</w:t>
-      </w:r>
-    </w:p>
-    <w:p>
-      <w:pPr>
-        <w:pStyle w:val="Heading2"/>
-      </w:pPr>
-      <w:r>
-        <w:t xml:space="preserve">4.2 Procesamiento de reversas</w:t>
-      </w:r>
-    </w:p>
-    <w:p>
-      <w:pPr>
-        <w:spacing w:after="160"/>
-        <w:jc w:val="both"/>
-      </w:pPr>
-      <w:r>
-        <w:rPr>
-          <w:b/>
-          <w:bCs/>
-        </w:rPr>
-        <w:t xml:space="preserve">Lo reportado en la encuesta:</w:t>
+        <w:t xml:space="preserve">"Asociados indican que plásticos le está dando bastante inconveniente al querer realizar compras; se realizan reposiciones muy frecuentemente porque plástico no funciona. El proceso de reposición es muy tardado".</w:t>
       </w:r>
     </w:p>
     <w:p>
@@ -5974,7 +5880,15 @@
         <w:spacing w:after="80"/>
       </w:pPr>
       <w:r>
-        <w:t xml:space="preserve">"La comunicación con la plataforma de Evertec principalmente al monto de reversas porque en ocasiones no las acepta Evertec…".</w:t>
+        <w:t xml:space="preserve">"Que cuando se olvida a los chicos de caja la clave, la reinicie Evertec, porque a veces cuesta que nos solucionen en tarjeta".</w:t>
+      </w:r>
+    </w:p>
+    <w:p>
+      <w:pPr>
+        <w:pStyle w:val="Heading2"/>
+      </w:pPr>
+      <w:r>
+        <w:t xml:space="preserve">4.4 Transparencia en abonos y notas de crédito</w:t>
       </w:r>
     </w:p>
     <w:p>
@@ -5987,7 +5901,15 @@
         <w:spacing w:after="80"/>
       </w:pPr>
       <w:r>
-        <w:t xml:space="preserve">"Las reversas de transacción".</w:t>
+        <w:t xml:space="preserve">"Actualmente, estos abonos se registran únicamente bajo el concepto de 'Nota de Crédito', lo que genera confusión entre los asociados al no identificar claramente el origen del descuento recibido. Una descripción más detallada contribuiría…".</w:t>
+      </w:r>
+    </w:p>
+    <w:p>
+      <w:pPr>
+        <w:pStyle w:val="Heading2"/>
+      </w:pPr>
+      <w:r>
+        <w:t xml:space="preserve">4.5 Fraude, tiempos de resolución y promociones</w:t>
       </w:r>
     </w:p>
     <w:p>
@@ -6000,20 +5922,7 @@
         <w:spacing w:after="80"/>
       </w:pPr>
       <w:r>
-        <w:t xml:space="preserve">"Las duplicidades en los pagos cuando hay caídas de sistemas: en Siscard lo toma y en sistema de Comedica no aparece procesado".</w:t>
-      </w:r>
-    </w:p>
-    <w:p>
-      <w:pPr>
-        <w:spacing w:after="160"/>
-        <w:jc w:val="both"/>
-      </w:pPr>
-      <w:r>
-        <w:rPr>
-          <w:b/>
-          <w:bCs/>
-        </w:rPr>
-        <w:t xml:space="preserve">Solicitamos:</w:t>
+        <w:t xml:space="preserve">"El fraude con las tarjetas y el reporte de compras fraudulentas".</w:t>
       </w:r>
     </w:p>
     <w:p>
@@ -6026,308 +5935,11 @@
         <w:spacing w:after="80"/>
       </w:pPr>
       <w:r>
-        <w:t xml:space="preserve">Corregir la causa por la que Evertec no acepta algunas reversas.</w:t>
-      </w:r>
-    </w:p>
-    <w:p>
-      <w:pPr>
-        <w:pStyle w:val="ListParagraph"/>
-        <w:numPr>
-          <w:ilvl w:val="0"/>
-          <w:numId w:val="2"/>
-        </w:numPr>
-        <w:spacing w:after="80"/>
-      </w:pPr>
-      <w:r>
-        <w:t xml:space="preserve">Asegurar que los pagos y reversas registrados en Siscard coincidan con los procesados en el sistema de Comedica, especialmente cuando hay caídas del sistema.</w:t>
-      </w:r>
-    </w:p>
-    <w:p>
-      <w:pPr>
-        <w:pStyle w:val="ListParagraph"/>
-        <w:numPr>
-          <w:ilvl w:val="0"/>
-          <w:numId w:val="2"/>
-        </w:numPr>
-        <w:spacing w:after="80"/>
-      </w:pPr>
-      <w:r>
-        <w:t xml:space="preserve">Definir cómo y en qué plazo se corregirán los pagos duplicados y las reversas no aplicadas.</w:t>
-      </w:r>
-    </w:p>
-    <w:p>
-      <w:pPr>
-        <w:pStyle w:val="Heading2"/>
-      </w:pPr>
-      <w:r>
-        <w:t xml:space="preserve">4.3 Calidad de los plásticos y tiempos de reposición</w:t>
-      </w:r>
-    </w:p>
-    <w:p>
-      <w:pPr>
-        <w:spacing w:after="160"/>
-        <w:jc w:val="both"/>
-      </w:pPr>
-      <w:r>
-        <w:rPr>
-          <w:b/>
-          <w:bCs/>
-        </w:rPr>
-        <w:t xml:space="preserve">Lo reportado en la encuesta:</w:t>
-      </w:r>
-    </w:p>
-    <w:p>
-      <w:pPr>
-        <w:pStyle w:val="ListParagraph"/>
-        <w:numPr>
-          <w:ilvl w:val="0"/>
-          <w:numId w:val="2"/>
-        </w:numPr>
-        <w:spacing w:after="80"/>
-      </w:pPr>
-      <w:r>
-        <w:t xml:space="preserve">"Asociados indican que plásticos le está dando bastante inconveniente al querer realizar compras; se realizan reposiciones muy frecuentemente porque plástico no funciona. El proceso de reposición es muy tardado".</w:t>
-      </w:r>
-    </w:p>
-    <w:p>
-      <w:pPr>
-        <w:pStyle w:val="ListParagraph"/>
-        <w:numPr>
-          <w:ilvl w:val="0"/>
-          <w:numId w:val="2"/>
-        </w:numPr>
-        <w:spacing w:after="80"/>
-      </w:pPr>
-      <w:r>
-        <w:t xml:space="preserve">"Que cuando se olvida a los chicos de caja la clave, la reinicie Evertec, porque a veces cuesta que nos solucionen en tarjeta".</w:t>
-      </w:r>
-    </w:p>
-    <w:p>
-      <w:pPr>
-        <w:spacing w:after="160"/>
-        <w:jc w:val="both"/>
-      </w:pPr>
-      <w:r>
-        <w:rPr>
-          <w:b/>
-          <w:bCs/>
-        </w:rPr>
-        <w:t xml:space="preserve">Solicitamos:</w:t>
-      </w:r>
-    </w:p>
-    <w:p>
-      <w:pPr>
-        <w:pStyle w:val="ListParagraph"/>
-        <w:numPr>
-          <w:ilvl w:val="0"/>
-          <w:numId w:val="2"/>
-        </w:numPr>
-        <w:spacing w:after="80"/>
-      </w:pPr>
-      <w:r>
-        <w:t xml:space="preserve">Revisar los plásticos que están fallando e identificar la causa.</w:t>
-      </w:r>
-    </w:p>
-    <w:p>
-      <w:pPr>
-        <w:pStyle w:val="ListParagraph"/>
-        <w:numPr>
-          <w:ilvl w:val="0"/>
-          <w:numId w:val="2"/>
-        </w:numPr>
-        <w:spacing w:after="80"/>
-      </w:pPr>
-      <w:r>
-        <w:t xml:space="preserve">Reducir el tiempo del proceso de reposición.</w:t>
-      </w:r>
-    </w:p>
-    <w:p>
-      <w:pPr>
-        <w:pStyle w:val="ListParagraph"/>
-        <w:numPr>
-          <w:ilvl w:val="0"/>
-          <w:numId w:val="2"/>
-        </w:numPr>
-        <w:spacing w:after="80"/>
-      </w:pPr>
-      <w:r>
-        <w:t xml:space="preserve">Agilizar el reinicio de clave del personal de caja.</w:t>
-      </w:r>
-    </w:p>
-    <w:p>
-      <w:pPr>
-        <w:pStyle w:val="Heading2"/>
-      </w:pPr>
-      <w:r>
-        <w:t xml:space="preserve">4.4 Transparencia en abonos y notas de crédito</w:t>
-      </w:r>
-    </w:p>
-    <w:p>
-      <w:pPr>
-        <w:spacing w:after="160"/>
-        <w:jc w:val="both"/>
-      </w:pPr>
-      <w:r>
-        <w:rPr>
-          <w:b/>
-          <w:bCs/>
-        </w:rPr>
-        <w:t xml:space="preserve">Lo reportado en la encuesta:</w:t>
-      </w:r>
-    </w:p>
-    <w:p>
-      <w:pPr>
-        <w:pStyle w:val="ListParagraph"/>
-        <w:numPr>
-          <w:ilvl w:val="0"/>
-          <w:numId w:val="2"/>
-        </w:numPr>
-        <w:spacing w:after="80"/>
-      </w:pPr>
-      <w:r>
-        <w:t xml:space="preserve">"Actualmente, estos abonos se registran únicamente bajo el concepto de 'Nota de Crédito', lo que genera confusión entre los asociados al no identificar claramente el origen del descuento recibido. Una descripción más detallada contribuiría…".</w:t>
-      </w:r>
-    </w:p>
-    <w:p>
-      <w:pPr>
-        <w:spacing w:after="160"/>
-        <w:jc w:val="both"/>
-      </w:pPr>
-      <w:r>
-        <w:rPr>
-          <w:b/>
-          <w:bCs/>
-        </w:rPr>
-        <w:t xml:space="preserve">Solicitamos:</w:t>
-      </w:r>
-    </w:p>
-    <w:p>
-      <w:pPr>
-        <w:pStyle w:val="ListParagraph"/>
-        <w:numPr>
-          <w:ilvl w:val="0"/>
-          <w:numId w:val="2"/>
-        </w:numPr>
-        <w:spacing w:after="80"/>
-      </w:pPr>
-      <w:r>
-        <w:t xml:space="preserve">Sustituir el concepto genérico "Nota de Crédito" por una descripción específica del beneficio o campaña que origina cada abono, para que el asociado identifique claramente el origen del descuento.</w:t>
-      </w:r>
-    </w:p>
-    <w:p>
-      <w:pPr>
-        <w:pStyle w:val="Heading2"/>
-      </w:pPr>
-      <w:r>
-        <w:t xml:space="preserve">4.5 Contracargos, fraude y acreditación de promociones</w:t>
-      </w:r>
-    </w:p>
-    <w:p>
-      <w:pPr>
-        <w:spacing w:after="160"/>
-        <w:jc w:val="both"/>
-      </w:pPr>
-      <w:r>
-        <w:rPr>
-          <w:b/>
-          <w:bCs/>
-        </w:rPr>
-        <w:t xml:space="preserve">Lo reportado en la encuesta:</w:t>
-      </w:r>
-    </w:p>
-    <w:p>
-      <w:pPr>
-        <w:pStyle w:val="ListParagraph"/>
-        <w:numPr>
-          <w:ilvl w:val="0"/>
-          <w:numId w:val="2"/>
-        </w:numPr>
-        <w:spacing w:after="80"/>
-      </w:pPr>
-      <w:r>
-        <w:t xml:space="preserve">"El fraude con las tarjetas y el reporte de compras fraudulentas".</w:t>
-      </w:r>
-    </w:p>
-    <w:p>
-      <w:pPr>
-        <w:pStyle w:val="ListParagraph"/>
-        <w:numPr>
-          <w:ilvl w:val="0"/>
-          <w:numId w:val="2"/>
-        </w:numPr>
-        <w:spacing w:after="80"/>
-      </w:pPr>
-      <w:r>
-        <w:t xml:space="preserve">"Los reclamos por contracargos deberían ser solo atendidos por depto. de T/C".</w:t>
-      </w:r>
-    </w:p>
-    <w:p>
-      <w:pPr>
-        <w:pStyle w:val="ListParagraph"/>
-        <w:numPr>
-          <w:ilvl w:val="0"/>
-          <w:numId w:val="2"/>
-        </w:numPr>
-        <w:spacing w:after="80"/>
-      </w:pPr>
-      <w:r>
         <w:t xml:space="preserve">"El tiempo de resolución", "tiempo de entrega" y "acreditación de puntos por promociones dentro de las fechas correspondientes".</w:t>
       </w:r>
     </w:p>
     <w:p>
       <w:pPr>
-        <w:spacing w:after="160"/>
-        <w:jc w:val="both"/>
-      </w:pPr>
-      <w:r>
-        <w:rPr>
-          <w:b/>
-          <w:bCs/>
-        </w:rPr>
-        <w:t xml:space="preserve">Solicitamos:</w:t>
-      </w:r>
-    </w:p>
-    <w:p>
-      <w:pPr>
-        <w:pStyle w:val="ListParagraph"/>
-        <w:numPr>
-          <w:ilvl w:val="0"/>
-          <w:numId w:val="2"/>
-        </w:numPr>
-        <w:spacing w:after="80"/>
-      </w:pPr>
-      <w:r>
-        <w:t xml:space="preserve">Mejorar la atención del reporte de compras fraudulentas.</w:t>
-      </w:r>
-    </w:p>
-    <w:p>
-      <w:pPr>
-        <w:pStyle w:val="ListParagraph"/>
-        <w:numPr>
-          <w:ilvl w:val="0"/>
-          <w:numId w:val="2"/>
-        </w:numPr>
-        <w:spacing w:after="80"/>
-      </w:pPr>
-      <w:r>
-        <w:t xml:space="preserve">Reducir los tiempos de resolución de reclamos y contracargos.</w:t>
-      </w:r>
-    </w:p>
-    <w:p>
-      <w:pPr>
-        <w:pStyle w:val="ListParagraph"/>
-        <w:numPr>
-          <w:ilvl w:val="0"/>
-          <w:numId w:val="2"/>
-        </w:numPr>
-        <w:spacing w:after="80"/>
-      </w:pPr>
-      <w:r>
-        <w:t xml:space="preserve">Acreditar los puntos por promociones dentro de las fechas correspondientes.</w:t>
-      </w:r>
-    </w:p>
-    <w:p>
-      <w:pPr>
         <w:pBdr>
           <w:bottom w:val="single" w:color="2E75B6" w:sz="6" w:space="1"/>
         </w:pBdr>
@@ -6339,7 +5951,7 @@
         <w:pStyle w:val="Heading1"/>
       </w:pPr>
       <w:r>
-        <w:t xml:space="preserve">5. PLAN DE ACCIÓN Y FECHAS COMPROMISO</w:t>
+        <w:t xml:space="preserve">5. OTRAS SUGERENCIAS DE LOS COLABORADORES</w:t>
       </w:r>
     </w:p>
     <w:p>
@@ -6348,392 +5960,7 @@
         <w:jc w:val="both"/>
       </w:pPr>
       <w:r>
-        <w:t xml:space="preserve">Comedica solicita a Evertec remitir un </w:t>
-      </w:r>
-      <w:r>
-        <w:rPr>
-          <w:b/>
-          <w:bCs/>
-        </w:rPr>
-        <w:t xml:space="preserve">plan de acción formal</w:t>
-      </w:r>
-      <w:r>
-        <w:t xml:space="preserve"> que indique, para cada uno de los cinco puntos anteriores, la causa identificada, las acciones a tomar, los responsables y las fechas compromiso. Se proponen las siguientes fechas:</w:t>
-      </w:r>
-    </w:p>
-    <w:tbl>
-      <w:tblPr>
-        <w:tblW w:type="dxa" w:w="9936"/>
-        <w:tblBorders>
-          <w:top w:val="single" w:color="auto" w:sz="4"/>
-          <w:left w:val="single" w:color="auto" w:sz="4"/>
-          <w:bottom w:val="single" w:color="auto" w:sz="4"/>
-          <w:right w:val="single" w:color="auto" w:sz="4"/>
-          <w:insideH w:val="single" w:color="auto" w:sz="4"/>
-          <w:insideV w:val="single" w:color="auto" w:sz="4"/>
-        </w:tblBorders>
-      </w:tblPr>
-      <w:tblGrid>
-        <w:gridCol w:w="5852"/>
-        <w:gridCol w:w="4084"/>
-      </w:tblGrid>
-      <w:tr>
-        <w:trPr>
-          <w:tblHeader/>
-        </w:trPr>
-        <w:tc>
-          <w:tcPr>
-            <w:tcW w:type="dxa" w:w="5852"/>
-            <w:tcBorders>
-              <w:top w:val="single" w:color="BFBFBF" w:sz="4"/>
-              <w:left w:val="single" w:color="BFBFBF" w:sz="4"/>
-              <w:bottom w:val="single" w:color="BFBFBF" w:sz="4"/>
-              <w:right w:val="single" w:color="BFBFBF" w:sz="4"/>
-            </w:tcBorders>
-            <w:shd w:fill="1F3864" w:color="auto" w:val="clear"/>
-            <w:tcMar>
-              <w:top w:type="dxa" w:w="50"/>
-              <w:left w:type="dxa" w:w="80"/>
-              <w:bottom w:type="dxa" w:w="50"/>
-              <w:right w:type="dxa" w:w="80"/>
-            </w:tcMar>
-          </w:tcPr>
-          <w:p>
-            <w:r>
-              <w:rPr>
-                <w:rFonts w:ascii="Calibri" w:cs="Calibri" w:eastAsia="Calibri" w:hAnsi="Calibri"/>
-                <w:b/>
-                <w:bCs/>
-                <w:color w:val="FFFFFF"/>
-                <w:sz w:val="19"/>
-                <w:szCs w:val="19"/>
-              </w:rPr>
-              <w:t xml:space="preserve">Actividad</w:t>
-            </w:r>
-          </w:p>
-        </w:tc>
-        <w:tc>
-          <w:tcPr>
-            <w:tcW w:type="dxa" w:w="4084"/>
-            <w:tcBorders>
-              <w:top w:val="single" w:color="BFBFBF" w:sz="4"/>
-              <w:left w:val="single" w:color="BFBFBF" w:sz="4"/>
-              <w:bottom w:val="single" w:color="BFBFBF" w:sz="4"/>
-              <w:right w:val="single" w:color="BFBFBF" w:sz="4"/>
-            </w:tcBorders>
-            <w:shd w:fill="1F3864" w:color="auto" w:val="clear"/>
-            <w:tcMar>
-              <w:top w:type="dxa" w:w="50"/>
-              <w:left w:type="dxa" w:w="80"/>
-              <w:bottom w:type="dxa" w:w="50"/>
-              <w:right w:type="dxa" w:w="80"/>
-            </w:tcMar>
-          </w:tcPr>
-          <w:p>
-            <w:r>
-              <w:rPr>
-                <w:rFonts w:ascii="Calibri" w:cs="Calibri" w:eastAsia="Calibri" w:hAnsi="Calibri"/>
-                <w:b/>
-                <w:bCs/>
-                <w:color w:val="FFFFFF"/>
-                <w:sz w:val="19"/>
-                <w:szCs w:val="19"/>
-              </w:rPr>
-              <w:t xml:space="preserve">Fecha propuesta</w:t>
-            </w:r>
-          </w:p>
-        </w:tc>
-      </w:tr>
-      <w:tr>
-        <w:trPr>
-          <w:tblHeader w:val="false"/>
-        </w:trPr>
-        <w:tc>
-          <w:tcPr>
-            <w:tcW w:type="dxa" w:w="5852"/>
-            <w:tcBorders>
-              <w:top w:val="single" w:color="BFBFBF" w:sz="4"/>
-              <w:left w:val="single" w:color="BFBFBF" w:sz="4"/>
-              <w:bottom w:val="single" w:color="BFBFBF" w:sz="4"/>
-              <w:right w:val="single" w:color="BFBFBF" w:sz="4"/>
-            </w:tcBorders>
-            <w:shd w:fill="FFFFFF" w:color="auto" w:val="clear"/>
-            <w:tcMar>
-              <w:top w:type="dxa" w:w="50"/>
-              <w:left w:type="dxa" w:w="80"/>
-              <w:bottom w:type="dxa" w:w="50"/>
-              <w:right w:type="dxa" w:w="80"/>
-            </w:tcMar>
-          </w:tcPr>
-          <w:p>
-            <w:r>
-              <w:rPr>
-                <w:rFonts w:ascii="Calibri" w:cs="Calibri" w:eastAsia="Calibri" w:hAnsi="Calibri"/>
-                <w:color w:val="000000"/>
-                <w:sz w:val="19"/>
-                <w:szCs w:val="19"/>
-              </w:rPr>
-              <w:t xml:space="preserve">Confirmación de recibido de este informe</w:t>
-            </w:r>
-          </w:p>
-        </w:tc>
-        <w:tc>
-          <w:tcPr>
-            <w:tcW w:type="dxa" w:w="4084"/>
-            <w:tcBorders>
-              <w:top w:val="single" w:color="BFBFBF" w:sz="4"/>
-              <w:left w:val="single" w:color="BFBFBF" w:sz="4"/>
-              <w:bottom w:val="single" w:color="BFBFBF" w:sz="4"/>
-              <w:right w:val="single" w:color="BFBFBF" w:sz="4"/>
-            </w:tcBorders>
-            <w:shd w:fill="FFFFFF" w:color="auto" w:val="clear"/>
-            <w:tcMar>
-              <w:top w:type="dxa" w:w="50"/>
-              <w:left w:type="dxa" w:w="80"/>
-              <w:bottom w:type="dxa" w:w="50"/>
-              <w:right w:type="dxa" w:w="80"/>
-            </w:tcMar>
-          </w:tcPr>
-          <w:p>
-            <w:r>
-              <w:rPr>
-                <w:rFonts w:ascii="Calibri" w:cs="Calibri" w:eastAsia="Calibri" w:hAnsi="Calibri"/>
-                <w:color w:val="000000"/>
-                <w:sz w:val="19"/>
-                <w:szCs w:val="19"/>
-              </w:rPr>
-              <w:t xml:space="preserve">Lunes 28 de septiembre de 2026</w:t>
-            </w:r>
-          </w:p>
-        </w:tc>
-      </w:tr>
-      <w:tr>
-        <w:trPr>
-          <w:tblHeader w:val="false"/>
-        </w:trPr>
-        <w:tc>
-          <w:tcPr>
-            <w:tcW w:type="dxa" w:w="5852"/>
-            <w:tcBorders>
-              <w:top w:val="single" w:color="BFBFBF" w:sz="4"/>
-              <w:left w:val="single" w:color="BFBFBF" w:sz="4"/>
-              <w:bottom w:val="single" w:color="BFBFBF" w:sz="4"/>
-              <w:right w:val="single" w:color="BFBFBF" w:sz="4"/>
-            </w:tcBorders>
-            <w:shd w:fill="EAF1FB" w:color="auto" w:val="clear"/>
-            <w:tcMar>
-              <w:top w:type="dxa" w:w="50"/>
-              <w:left w:type="dxa" w:w="80"/>
-              <w:bottom w:type="dxa" w:w="50"/>
-              <w:right w:type="dxa" w:w="80"/>
-            </w:tcMar>
-          </w:tcPr>
-          <w:p>
-            <w:r>
-              <w:rPr>
-                <w:rFonts w:ascii="Calibri" w:cs="Calibri" w:eastAsia="Calibri" w:hAnsi="Calibri"/>
-                <w:color w:val="000000"/>
-                <w:sz w:val="19"/>
-                <w:szCs w:val="19"/>
-              </w:rPr>
-              <w:t xml:space="preserve">Reunión de trabajo entre Evertec y Comedica</w:t>
-            </w:r>
-          </w:p>
-        </w:tc>
-        <w:tc>
-          <w:tcPr>
-            <w:tcW w:type="dxa" w:w="4084"/>
-            <w:tcBorders>
-              <w:top w:val="single" w:color="BFBFBF" w:sz="4"/>
-              <w:left w:val="single" w:color="BFBFBF" w:sz="4"/>
-              <w:bottom w:val="single" w:color="BFBFBF" w:sz="4"/>
-              <w:right w:val="single" w:color="BFBFBF" w:sz="4"/>
-            </w:tcBorders>
-            <w:shd w:fill="EAF1FB" w:color="auto" w:val="clear"/>
-            <w:tcMar>
-              <w:top w:type="dxa" w:w="50"/>
-              <w:left w:type="dxa" w:w="80"/>
-              <w:bottom w:type="dxa" w:w="50"/>
-              <w:right w:type="dxa" w:w="80"/>
-            </w:tcMar>
-          </w:tcPr>
-          <w:p>
-            <w:r>
-              <w:rPr>
-                <w:rFonts w:ascii="Calibri" w:cs="Calibri" w:eastAsia="Calibri" w:hAnsi="Calibri"/>
-                <w:color w:val="000000"/>
-                <w:sz w:val="19"/>
-                <w:szCs w:val="19"/>
-              </w:rPr>
-              <w:t xml:space="preserve">Jueves 1 de octubre de 2026</w:t>
-            </w:r>
-          </w:p>
-        </w:tc>
-      </w:tr>
-      <w:tr>
-        <w:trPr>
-          <w:tblHeader w:val="false"/>
-        </w:trPr>
-        <w:tc>
-          <w:tcPr>
-            <w:tcW w:type="dxa" w:w="5852"/>
-            <w:tcBorders>
-              <w:top w:val="single" w:color="BFBFBF" w:sz="4"/>
-              <w:left w:val="single" w:color="BFBFBF" w:sz="4"/>
-              <w:bottom w:val="single" w:color="BFBFBF" w:sz="4"/>
-              <w:right w:val="single" w:color="BFBFBF" w:sz="4"/>
-            </w:tcBorders>
-            <w:shd w:fill="FFFFFF" w:color="auto" w:val="clear"/>
-            <w:tcMar>
-              <w:top w:type="dxa" w:w="50"/>
-              <w:left w:type="dxa" w:w="80"/>
-              <w:bottom w:type="dxa" w:w="50"/>
-              <w:right w:type="dxa" w:w="80"/>
-            </w:tcMar>
-          </w:tcPr>
-          <w:p>
-            <w:r>
-              <w:rPr>
-                <w:rFonts w:ascii="Calibri" w:cs="Calibri" w:eastAsia="Calibri" w:hAnsi="Calibri"/>
-                <w:color w:val="000000"/>
-                <w:sz w:val="19"/>
-                <w:szCs w:val="19"/>
-              </w:rPr>
-              <w:t xml:space="preserve">Entrega del plan de acción formal</w:t>
-            </w:r>
-          </w:p>
-        </w:tc>
-        <w:tc>
-          <w:tcPr>
-            <w:tcW w:type="dxa" w:w="4084"/>
-            <w:tcBorders>
-              <w:top w:val="single" w:color="BFBFBF" w:sz="4"/>
-              <w:left w:val="single" w:color="BFBFBF" w:sz="4"/>
-              <w:bottom w:val="single" w:color="BFBFBF" w:sz="4"/>
-              <w:right w:val="single" w:color="BFBFBF" w:sz="4"/>
-            </w:tcBorders>
-            <w:shd w:fill="FFFFFF" w:color="auto" w:val="clear"/>
-            <w:tcMar>
-              <w:top w:type="dxa" w:w="50"/>
-              <w:left w:type="dxa" w:w="80"/>
-              <w:bottom w:type="dxa" w:w="50"/>
-              <w:right w:type="dxa" w:w="80"/>
-            </w:tcMar>
-          </w:tcPr>
-          <w:p>
-            <w:r>
-              <w:rPr>
-                <w:rFonts w:ascii="Calibri" w:cs="Calibri" w:eastAsia="Calibri" w:hAnsi="Calibri"/>
-                <w:color w:val="000000"/>
-                <w:sz w:val="19"/>
-                <w:szCs w:val="19"/>
-              </w:rPr>
-              <w:t xml:space="preserve">Jueves 8 de octubre de 2026</w:t>
-            </w:r>
-          </w:p>
-        </w:tc>
-      </w:tr>
-      <w:tr>
-        <w:trPr>
-          <w:tblHeader w:val="false"/>
-        </w:trPr>
-        <w:tc>
-          <w:tcPr>
-            <w:tcW w:type="dxa" w:w="5852"/>
-            <w:tcBorders>
-              <w:top w:val="single" w:color="BFBFBF" w:sz="4"/>
-              <w:left w:val="single" w:color="BFBFBF" w:sz="4"/>
-              <w:bottom w:val="single" w:color="BFBFBF" w:sz="4"/>
-              <w:right w:val="single" w:color="BFBFBF" w:sz="4"/>
-            </w:tcBorders>
-            <w:shd w:fill="EAF1FB" w:color="auto" w:val="clear"/>
-            <w:tcMar>
-              <w:top w:type="dxa" w:w="50"/>
-              <w:left w:type="dxa" w:w="80"/>
-              <w:bottom w:type="dxa" w:w="50"/>
-              <w:right w:type="dxa" w:w="80"/>
-            </w:tcMar>
-          </w:tcPr>
-          <w:p>
-            <w:r>
-              <w:rPr>
-                <w:rFonts w:ascii="Calibri" w:cs="Calibri" w:eastAsia="Calibri" w:hAnsi="Calibri"/>
-                <w:color w:val="000000"/>
-                <w:sz w:val="19"/>
-                <w:szCs w:val="19"/>
-              </w:rPr>
-              <w:t xml:space="preserve">Primer informe de avance</w:t>
-            </w:r>
-          </w:p>
-        </w:tc>
-        <w:tc>
-          <w:tcPr>
-            <w:tcW w:type="dxa" w:w="4084"/>
-            <w:tcBorders>
-              <w:top w:val="single" w:color="BFBFBF" w:sz="4"/>
-              <w:left w:val="single" w:color="BFBFBF" w:sz="4"/>
-              <w:bottom w:val="single" w:color="BFBFBF" w:sz="4"/>
-              <w:right w:val="single" w:color="BFBFBF" w:sz="4"/>
-            </w:tcBorders>
-            <w:shd w:fill="EAF1FB" w:color="auto" w:val="clear"/>
-            <w:tcMar>
-              <w:top w:type="dxa" w:w="50"/>
-              <w:left w:type="dxa" w:w="80"/>
-              <w:bottom w:type="dxa" w:w="50"/>
-              <w:right w:type="dxa" w:w="80"/>
-            </w:tcMar>
-          </w:tcPr>
-          <w:p>
-            <w:r>
-              <w:rPr>
-                <w:rFonts w:ascii="Calibri" w:cs="Calibri" w:eastAsia="Calibri" w:hAnsi="Calibri"/>
-                <w:color w:val="000000"/>
-                <w:sz w:val="19"/>
-                <w:szCs w:val="19"/>
-              </w:rPr>
-              <w:t xml:space="preserve">Viernes 30 de octubre de 2026</w:t>
-            </w:r>
-          </w:p>
-        </w:tc>
-      </w:tr>
-    </w:tbl>
-    <w:p>
-      <w:pPr>
-        <w:spacing w:after="80"/>
-      </w:pPr>
-    </w:p>
-    <w:p>
-      <w:pPr>
-        <w:spacing w:after="160"/>
-        <w:jc w:val="both"/>
-      </w:pPr>
-      <w:r>
-        <w:t xml:space="preserve">Comedica dará seguimiento a estos compromisos, y los resultados serán considerados en la próxima evaluación del servicio.</w:t>
-      </w:r>
-    </w:p>
-    <w:p>
-      <w:pPr>
-        <w:pBdr>
-          <w:bottom w:val="single" w:color="2E75B6" w:sz="6" w:space="1"/>
-        </w:pBdr>
-        <w:spacing w:after="200"/>
-      </w:pPr>
-    </w:p>
-    <w:p>
-      <w:pPr>
-        <w:pStyle w:val="Heading1"/>
-      </w:pPr>
-      <w:r>
-        <w:t xml:space="preserve">6. PUNTOS PARA EL EQUIPO DIRECTIVO DE COMEDICA</w:t>
-      </w:r>
-    </w:p>
-    <w:p>
-      <w:pPr>
-        <w:spacing w:after="160"/>
-        <w:jc w:val="both"/>
-      </w:pPr>
-      <w:r>
-        <w:t xml:space="preserve">Los colaboradores también reportaron aspectos que corresponden a Comedica:</w:t>
+        <w:t xml:space="preserve">Los colaboradores también hicieron las siguientes sugerencias:</w:t>
       </w:r>
     </w:p>
     <w:p>
@@ -6777,15 +6004,6 @@
     </w:p>
     <w:p>
       <w:pPr>
-        <w:spacing w:after="160"/>
-        <w:jc w:val="both"/>
-      </w:pPr>
-      <w:r>
-        <w:t xml:space="preserve">Se solicita al equipo directivo evaluar estos puntos y definir a los responsables de darles seguimiento.</w:t>
-      </w:r>
-    </w:p>
-    <w:p>
-      <w:pPr>
         <w:pBdr>
           <w:bottom w:val="single" w:color="2E75B6" w:sz="6" w:space="1"/>
         </w:pBdr>
@@ -6797,7 +6015,7 @@
         <w:pStyle w:val="Heading1"/>
       </w:pPr>
       <w:r>
-        <w:t xml:space="preserve">7. CONCLUSIONES</w:t>
+        <w:t xml:space="preserve">6. CONCLUSIONES</w:t>
       </w:r>
     </w:p>
     <w:p>
@@ -6850,59 +6068,6 @@
       </w:pPr>
       <w:r>
         <w:t xml:space="preserve">Los problemas más reportados son la estabilidad y lentitud del sistema, las reversas, los plásticos, la falta de detalle en las notas de crédito, y la atención de fraudes, contracargos y promociones.</w:t>
-      </w:r>
-    </w:p>
-    <w:p>
-      <w:pPr>
-        <w:pStyle w:val="ListParagraph"/>
-        <w:numPr>
-          <w:ilvl w:val="0"/>
-          <w:numId w:val="4"/>
-        </w:numPr>
-        <w:spacing w:after="80"/>
-      </w:pPr>
-      <w:r>
-        <w:t xml:space="preserve">Se requiere que Evertec presente un plan de acción con fechas compromiso y que el equipo directivo de Comedica atienda los puntos internos señalados por los colaboradores.</w:t>
-      </w:r>
-    </w:p>
-    <w:p>
-      <w:pPr>
-        <w:spacing w:after="160"/>
-        <w:jc w:val="both"/>
-      </w:pPr>
-      <w:r>
-        <w:t xml:space="preserve">Atentamente,</w:t>
-      </w:r>
-    </w:p>
-    <w:p>
-      <w:pPr>
-        <w:spacing w:after="160"/>
-        <w:jc w:val="both"/>
-      </w:pPr>
-      <w:r>
-        <w:rPr>
-          <w:b/>
-          <w:bCs/>
-        </w:rPr>
-        <w:t xml:space="preserve">[Nombre]</w:t>
-      </w:r>
-    </w:p>
-    <w:p>
-      <w:pPr>
-        <w:spacing w:after="160"/>
-        <w:jc w:val="both"/>
-      </w:pPr>
-      <w:r>
-        <w:t xml:space="preserve">[Cargo]</w:t>
-      </w:r>
-    </w:p>
-    <w:p>
-      <w:pPr>
-        <w:spacing w:after="160"/>
-        <w:jc w:val="both"/>
-      </w:pPr>
-      <w:r>
-        <w:t xml:space="preserve">Comedica</w:t>
       </w:r>
     </w:p>
     <w:sectPr>

</xml_diff>

<commit_message>
Eliminar contenido redundante del informe
Co-Authored-By: Claude Opus 5.5 <noreply@anthropic.com>
Claude-Session: https://claude.ai/code/session_01DdHtXnKkH2zWgkQRN2ahpo
</commit_message>
<xml_diff>
--- a/informes/Informe_Ejecutivo_Evertec_Septiembre_2026.docx
+++ b/informes/Informe_Ejecutivo_Evertec_Septiembre_2026.docx
@@ -584,7 +584,7 @@
         <w:jc w:val="both"/>
       </w:pPr>
       <w:r>
-        <w:t xml:space="preserve">El presente informe presenta los resultados de la Encuesta de Evaluación del Servicio de Procesamiento de Tarjetas de Crédito (Evertec), contestada el 16 y 17 de septiembre de 2026 por 17 colaboradores de Comedica de las agencias San Miguel, Colonia Médica, Sonsonate, Santa Ana, Plaza Mundo, Plaza Merliot, Colegio Médico, Usulután, Central y Jefe Móvil. En la calificación general del servicio, 14 colaboradores asignaron nota de 4 y 3 colaboradores nota de 3. Sin embargo, 9 de los 17 colaboradores consideran que resolver los casos es "Regular" o "Difícil", y 14 de los 17 reportaron problemas que deben corregirse: fallas y lentitud del sistema, reversas no aceptadas, plásticos que no funcionan, abonos registrados como "Nota de Crédito" sin detalle, y la atención de fraudes, contracargos y promociones.</w:t>
+        <w:t xml:space="preserve">El presente informe muestra los resultados de la Encuesta de Evaluación del Servicio de Procesamiento de Tarjetas de Crédito (Evertec), contestada por el personal de agencias de Comedica. Su propósito es conocer la opinión del personal sobre la atención, la solución de casos y la calidad general del servicio de Evertec, e identificar los problemas que enfrentan en el día a día.</w:t>
       </w:r>
     </w:p>
     <w:p>
@@ -603,105 +603,6 @@
         <w:t xml:space="preserve">2. MÉTRICAS CLAVE</w:t>
       </w:r>
     </w:p>
-    <w:p>
-      <w:pPr>
-        <w:pStyle w:val="Heading2"/>
-      </w:pPr>
-      <w:r>
-        <w:t xml:space="preserve">¿Quiénes participaron?</w:t>
-      </w:r>
-    </w:p>
-    <w:p>
-      <w:pPr>
-        <w:pStyle w:val="ListParagraph"/>
-        <w:numPr>
-          <w:ilvl w:val="0"/>
-          <w:numId w:val="2"/>
-        </w:numPr>
-        <w:spacing w:after="80"/>
-      </w:pPr>
-      <w:r>
-        <w:rPr>
-          <w:b/>
-          <w:bCs/>
-        </w:rPr>
-        <w:t xml:space="preserve">17 colaboradores</w:t>
-      </w:r>
-      <w:r>
-        <w:t xml:space="preserve"> de Comedica respondieron la encuesta.</w:t>
-      </w:r>
-    </w:p>
-    <w:p>
-      <w:pPr>
-        <w:pStyle w:val="ListParagraph"/>
-        <w:numPr>
-          <w:ilvl w:val="0"/>
-          <w:numId w:val="2"/>
-        </w:numPr>
-        <w:spacing w:after="80"/>
-      </w:pPr>
-      <w:r>
-        <w:t xml:space="preserve">Participaron </w:t>
-      </w:r>
-      <w:r>
-        <w:rPr>
-          <w:b/>
-          <w:bCs/>
-        </w:rPr>
-        <w:t xml:space="preserve">9 agencias y Jefe Móvil</w:t>
-      </w:r>
-      <w:r>
-        <w:t xml:space="preserve">: San Miguel, Colonia Médica, Sonsonate, Santa Ana, Plaza Mundo, Plaza Merliot, Colegio Médico, Usulután, Central y Jefe Móvil.</w:t>
-      </w:r>
-    </w:p>
-    <w:p>
-      <w:pPr>
-        <w:pStyle w:val="ListParagraph"/>
-        <w:numPr>
-          <w:ilvl w:val="0"/>
-          <w:numId w:val="2"/>
-        </w:numPr>
-        <w:spacing w:after="80"/>
-      </w:pPr>
-      <w:r>
-        <w:t xml:space="preserve">Las respuestas se recibieron el </w:t>
-      </w:r>
-      <w:r>
-        <w:rPr>
-          <w:b/>
-          <w:bCs/>
-        </w:rPr>
-        <w:t xml:space="preserve">16 y 17 de septiembre de 2026</w:t>
-      </w:r>
-      <w:r>
-        <w:t xml:space="preserve">.</w:t>
-      </w:r>
-    </w:p>
-    <w:p>
-      <w:pPr>
-        <w:pStyle w:val="ListParagraph"/>
-        <w:numPr>
-          <w:ilvl w:val="0"/>
-          <w:numId w:val="2"/>
-        </w:numPr>
-        <w:spacing w:after="80"/>
-      </w:pPr>
-      <w:r>
-        <w:rPr>
-          <w:b/>
-          <w:bCs/>
-        </w:rPr>
-        <w:t xml:space="preserve">Todas las encuestas recibidas se contestaron completas.</w:t>
-      </w:r>
-    </w:p>
-    <w:p>
-      <w:pPr>
-        <w:pStyle w:val="Heading2"/>
-      </w:pPr>
-      <w:r>
-        <w:t xml:space="preserve">¿Qué opina el personal del servicio de Evertec?</w:t>
-      </w:r>
-    </w:p>
     <w:tbl>
       <w:tblPr>
         <w:tblW w:type="dxa" w:w="9936"/>
@@ -715,9 +616,8 @@
         </w:tblBorders>
       </w:tblPr>
       <w:tblGrid>
-        <w:gridCol w:w="3161"/>
-        <w:gridCol w:w="3387"/>
-        <w:gridCol w:w="3388"/>
+        <w:gridCol w:w="4796"/>
+        <w:gridCol w:w="5140"/>
       </w:tblGrid>
       <w:tr>
         <w:trPr>
@@ -725,7 +625,7 @@
         </w:trPr>
         <w:tc>
           <w:tcPr>
-            <w:tcW w:type="dxa" w:w="3161"/>
+            <w:tcW w:type="dxa" w:w="4796"/>
             <w:tcBorders>
               <w:top w:val="single" w:color="BFBFBF" w:sz="4"/>
               <w:left w:val="single" w:color="BFBFBF" w:sz="4"/>
@@ -756,7 +656,7 @@
         </w:tc>
         <w:tc>
           <w:tcPr>
-            <w:tcW w:type="dxa" w:w="3387"/>
+            <w:tcW w:type="dxa" w:w="5140"/>
             <w:tcBorders>
               <w:top w:val="single" w:color="BFBFBF" w:sz="4"/>
               <w:left w:val="single" w:color="BFBFBF" w:sz="4"/>
@@ -785,37 +685,6 @@
             </w:r>
           </w:p>
         </w:tc>
-        <w:tc>
-          <w:tcPr>
-            <w:tcW w:type="dxa" w:w="3388"/>
-            <w:tcBorders>
-              <w:top w:val="single" w:color="BFBFBF" w:sz="4"/>
-              <w:left w:val="single" w:color="BFBFBF" w:sz="4"/>
-              <w:bottom w:val="single" w:color="BFBFBF" w:sz="4"/>
-              <w:right w:val="single" w:color="BFBFBF" w:sz="4"/>
-            </w:tcBorders>
-            <w:shd w:fill="1F3864" w:color="auto" w:val="clear"/>
-            <w:tcMar>
-              <w:top w:type="dxa" w:w="50"/>
-              <w:left w:type="dxa" w:w="80"/>
-              <w:bottom w:type="dxa" w:w="50"/>
-              <w:right w:type="dxa" w:w="80"/>
-            </w:tcMar>
-          </w:tcPr>
-          <w:p>
-            <w:r>
-              <w:rPr>
-                <w:rFonts w:ascii="Calibri" w:cs="Calibri" w:eastAsia="Calibri" w:hAnsi="Calibri"/>
-                <w:b/>
-                <w:bCs/>
-                <w:color w:val="FFFFFF"/>
-                <w:sz w:val="19"/>
-                <w:szCs w:val="19"/>
-              </w:rPr>
-              <w:t xml:space="preserve">¿Qué significa para Comedica?</w:t>
-            </w:r>
-          </w:p>
-        </w:tc>
       </w:tr>
       <w:tr>
         <w:trPr>
@@ -823,7 +692,7 @@
         </w:trPr>
         <w:tc>
           <w:tcPr>
-            <w:tcW w:type="dxa" w:w="3161"/>
+            <w:tcW w:type="dxa" w:w="4796"/>
             <w:tcBorders>
               <w:top w:val="single" w:color="BFBFBF" w:sz="4"/>
               <w:left w:val="single" w:color="BFBFBF" w:sz="4"/>
@@ -852,7 +721,7 @@
         </w:tc>
         <w:tc>
           <w:tcPr>
-            <w:tcW w:type="dxa" w:w="3387"/>
+            <w:tcW w:type="dxa" w:w="5140"/>
             <w:tcBorders>
               <w:top w:val="single" w:color="BFBFBF" w:sz="4"/>
               <w:left w:val="single" w:color="BFBFBF" w:sz="4"/>
@@ -875,36 +744,7 @@
                 <w:sz w:val="19"/>
                 <w:szCs w:val="19"/>
               </w:rPr>
-              <w:t xml:space="preserve">14 de 17 colaboradores le dieron nota de 4; los otros 3 le dieron nota de 3. Nadie le dio una nota menor.</w:t>
-            </w:r>
-          </w:p>
-        </w:tc>
-        <w:tc>
-          <w:tcPr>
-            <w:tcW w:type="dxa" w:w="3388"/>
-            <w:tcBorders>
-              <w:top w:val="single" w:color="BFBFBF" w:sz="4"/>
-              <w:left w:val="single" w:color="BFBFBF" w:sz="4"/>
-              <w:bottom w:val="single" w:color="BFBFBF" w:sz="4"/>
-              <w:right w:val="single" w:color="BFBFBF" w:sz="4"/>
-            </w:tcBorders>
-            <w:shd w:fill="FFFFFF" w:color="auto" w:val="clear"/>
-            <w:tcMar>
-              <w:top w:type="dxa" w:w="50"/>
-              <w:left w:type="dxa" w:w="80"/>
-              <w:bottom w:type="dxa" w:w="50"/>
-              <w:right w:type="dxa" w:w="80"/>
-            </w:tcMar>
-          </w:tcPr>
-          <w:p>
-            <w:r>
-              <w:rPr>
-                <w:rFonts w:ascii="Calibri" w:cs="Calibri" w:eastAsia="Calibri" w:hAnsi="Calibri"/>
-                <w:color w:val="000000"/>
-                <w:sz w:val="19"/>
-                <w:szCs w:val="19"/>
-              </w:rPr>
-              <w:t xml:space="preserve">El personal está conforme con el servicio, pero todavía hay aspectos por mejorar.</w:t>
+              <w:t xml:space="preserve">14 colaboradores le dieron nota de 4 y 3 le dieron nota de 3.</w:t>
             </w:r>
           </w:p>
         </w:tc>
@@ -915,7 +755,7 @@
         </w:trPr>
         <w:tc>
           <w:tcPr>
-            <w:tcW w:type="dxa" w:w="3161"/>
+            <w:tcW w:type="dxa" w:w="4796"/>
             <w:tcBorders>
               <w:top w:val="single" w:color="BFBFBF" w:sz="4"/>
               <w:left w:val="single" w:color="BFBFBF" w:sz="4"/>
@@ -944,7 +784,7 @@
         </w:tc>
         <w:tc>
           <w:tcPr>
-            <w:tcW w:type="dxa" w:w="3387"/>
+            <w:tcW w:type="dxa" w:w="5140"/>
             <w:tcBorders>
               <w:top w:val="single" w:color="BFBFBF" w:sz="4"/>
               <w:left w:val="single" w:color="BFBFBF" w:sz="4"/>
@@ -967,36 +807,7 @@
                 <w:sz w:val="19"/>
                 <w:szCs w:val="19"/>
               </w:rPr>
-              <w:t xml:space="preserve">15 de 17 dicen que Evertec los atiende a tiempo; solo 2 dicen que la atención es regular.</w:t>
-            </w:r>
-          </w:p>
-        </w:tc>
-        <w:tc>
-          <w:tcPr>
-            <w:tcW w:type="dxa" w:w="3388"/>
-            <w:tcBorders>
-              <w:top w:val="single" w:color="BFBFBF" w:sz="4"/>
-              <w:left w:val="single" w:color="BFBFBF" w:sz="4"/>
-              <w:bottom w:val="single" w:color="BFBFBF" w:sz="4"/>
-              <w:right w:val="single" w:color="BFBFBF" w:sz="4"/>
-            </w:tcBorders>
-            <w:shd w:fill="EAF1FB" w:color="auto" w:val="clear"/>
-            <w:tcMar>
-              <w:top w:type="dxa" w:w="50"/>
-              <w:left w:type="dxa" w:w="80"/>
-              <w:bottom w:type="dxa" w:w="50"/>
-              <w:right w:type="dxa" w:w="80"/>
-            </w:tcMar>
-          </w:tcPr>
-          <w:p>
-            <w:r>
-              <w:rPr>
-                <w:rFonts w:ascii="Calibri" w:cs="Calibri" w:eastAsia="Calibri" w:hAnsi="Calibri"/>
-                <w:color w:val="000000"/>
-                <w:sz w:val="19"/>
-                <w:szCs w:val="19"/>
-              </w:rPr>
-              <w:t xml:space="preserve">Cuando se reporta un problema, Evertec responde a tiempo.</w:t>
+              <w:t xml:space="preserve">15 dicen que Evertec los atiende a tiempo y 2 que la atención es regular.</w:t>
             </w:r>
           </w:p>
         </w:tc>
@@ -1007,7 +818,7 @@
         </w:trPr>
         <w:tc>
           <w:tcPr>
-            <w:tcW w:type="dxa" w:w="3161"/>
+            <w:tcW w:type="dxa" w:w="4796"/>
             <w:tcBorders>
               <w:top w:val="single" w:color="BFBFBF" w:sz="4"/>
               <w:left w:val="single" w:color="BFBFBF" w:sz="4"/>
@@ -1036,7 +847,7 @@
         </w:tc>
         <w:tc>
           <w:tcPr>
-            <w:tcW w:type="dxa" w:w="3387"/>
+            <w:tcW w:type="dxa" w:w="5140"/>
             <w:tcBorders>
               <w:top w:val="single" w:color="BFBFBF" w:sz="4"/>
               <w:left w:val="single" w:color="BFBFBF" w:sz="4"/>
@@ -1059,45 +870,7 @@
                 <w:sz w:val="19"/>
                 <w:szCs w:val="19"/>
               </w:rPr>
-              <w:t xml:space="preserve">8 de 17 dicen que es fácil o muy fácil; 8 dicen que es regular y 1 dice que es difícil.</w:t>
-            </w:r>
-          </w:p>
-        </w:tc>
-        <w:tc>
-          <w:tcPr>
-            <w:tcW w:type="dxa" w:w="3388"/>
-            <w:tcBorders>
-              <w:top w:val="single" w:color="BFBFBF" w:sz="4"/>
-              <w:left w:val="single" w:color="BFBFBF" w:sz="4"/>
-              <w:bottom w:val="single" w:color="BFBFBF" w:sz="4"/>
-              <w:right w:val="single" w:color="BFBFBF" w:sz="4"/>
-            </w:tcBorders>
-            <w:shd w:fill="FFFFFF" w:color="auto" w:val="clear"/>
-            <w:tcMar>
-              <w:top w:type="dxa" w:w="50"/>
-              <w:left w:type="dxa" w:w="80"/>
-              <w:bottom w:type="dxa" w:w="50"/>
-              <w:right w:type="dxa" w:w="80"/>
-            </w:tcMar>
-          </w:tcPr>
-          <w:p>
-            <w:r>
-              <w:rPr>
-                <w:rFonts w:ascii="Calibri" w:cs="Calibri" w:eastAsia="Calibri" w:hAnsi="Calibri"/>
-                <w:color w:val="000000"/>
-                <w:sz w:val="19"/>
-                <w:szCs w:val="19"/>
-              </w:rPr>
-              <w:t xml:space="preserve">Evertec atiende rápido, pero a más de la mitad del personal le cuesta que el problema quede resuelto. </w:t>
-            </w:r>
-            <w:r>
-              <w:rPr>
-                <w:rFonts w:ascii="Calibri" w:cs="Calibri" w:eastAsia="Calibri" w:hAnsi="Calibri"/>
-                <w:color w:val="000000"/>
-                <w:sz w:val="19"/>
-                <w:szCs w:val="19"/>
-              </w:rPr>
-              <w:t xml:space="preserve">Es el punto más débil.</w:t>
+              <w:t xml:space="preserve">8 dicen que es fácil o muy fácil, 8 que es regular y 1 que es difícil.</w:t>
             </w:r>
           </w:p>
         </w:tc>
@@ -1108,7 +881,7 @@
         </w:trPr>
         <w:tc>
           <w:tcPr>
-            <w:tcW w:type="dxa" w:w="3161"/>
+            <w:tcW w:type="dxa" w:w="4796"/>
             <w:tcBorders>
               <w:top w:val="single" w:color="BFBFBF" w:sz="4"/>
               <w:left w:val="single" w:color="BFBFBF" w:sz="4"/>
@@ -1137,7 +910,7 @@
         </w:tc>
         <w:tc>
           <w:tcPr>
-            <w:tcW w:type="dxa" w:w="3387"/>
+            <w:tcW w:type="dxa" w:w="5140"/>
             <w:tcBorders>
               <w:top w:val="single" w:color="BFBFBF" w:sz="4"/>
               <w:left w:val="single" w:color="BFBFBF" w:sz="4"/>
@@ -1160,36 +933,7 @@
                 <w:sz w:val="19"/>
                 <w:szCs w:val="19"/>
               </w:rPr>
-              <w:t xml:space="preserve">7 de 17 dicen que pasa con frecuencia; 5 dicen que a veces y 5 que casi nunca.</w:t>
-            </w:r>
-          </w:p>
-        </w:tc>
-        <w:tc>
-          <w:tcPr>
-            <w:tcW w:type="dxa" w:w="3388"/>
-            <w:tcBorders>
-              <w:top w:val="single" w:color="BFBFBF" w:sz="4"/>
-              <w:left w:val="single" w:color="BFBFBF" w:sz="4"/>
-              <w:bottom w:val="single" w:color="BFBFBF" w:sz="4"/>
-              <w:right w:val="single" w:color="BFBFBF" w:sz="4"/>
-            </w:tcBorders>
-            <w:shd w:fill="EAF1FB" w:color="auto" w:val="clear"/>
-            <w:tcMar>
-              <w:top w:type="dxa" w:w="50"/>
-              <w:left w:type="dxa" w:w="80"/>
-              <w:bottom w:type="dxa" w:w="50"/>
-              <w:right w:type="dxa" w:w="80"/>
-            </w:tcMar>
-          </w:tcPr>
-          <w:p>
-            <w:r>
-              <w:rPr>
-                <w:rFonts w:ascii="Calibri" w:cs="Calibri" w:eastAsia="Calibri" w:hAnsi="Calibri"/>
-                <w:color w:val="000000"/>
-                <w:sz w:val="19"/>
-                <w:szCs w:val="19"/>
-              </w:rPr>
-              <w:t xml:space="preserve">Casi la mitad del personal enfrenta problemas con frecuencia, lo que afecta la atención a los asociados en ventanilla.</w:t>
+              <w:t xml:space="preserve">7 dicen que con frecuencia, 5 que a veces y 5 que casi nunca.</w:t>
             </w:r>
           </w:p>
         </w:tc>
@@ -1199,74 +943,6 @@
       <w:pPr>
         <w:spacing w:after="80"/>
       </w:pPr>
-    </w:p>
-    <w:p>
-      <w:pPr>
-        <w:pStyle w:val="Heading2"/>
-      </w:pPr>
-      <w:r>
-        <w:t xml:space="preserve">En pocas palabras</w:t>
-      </w:r>
-    </w:p>
-    <w:p>
-      <w:pPr>
-        <w:pStyle w:val="ListParagraph"/>
-        <w:numPr>
-          <w:ilvl w:val="0"/>
-          <w:numId w:val="2"/>
-        </w:numPr>
-        <w:spacing w:after="80"/>
-      </w:pPr>
-      <w:r>
-        <w:rPr>
-          <w:b/>
-          <w:bCs/>
-        </w:rPr>
-        <w:t xml:space="preserve">Lo bueno:</w:t>
-      </w:r>
-      <w:r>
-        <w:t xml:space="preserve"> el servicio funciona y Evertec atiende a tiempo cuando se le reporta un problema.</w:t>
-      </w:r>
-    </w:p>
-    <w:p>
-      <w:pPr>
-        <w:pStyle w:val="ListParagraph"/>
-        <w:numPr>
-          <w:ilvl w:val="0"/>
-          <w:numId w:val="2"/>
-        </w:numPr>
-        <w:spacing w:after="80"/>
-      </w:pPr>
-      <w:r>
-        <w:rPr>
-          <w:b/>
-          <w:bCs/>
-        </w:rPr>
-        <w:t xml:space="preserve">Lo que hay que mejorar:</w:t>
-      </w:r>
-      <w:r>
-        <w:t xml:space="preserve"> que los problemas se resuelvan a la primera y que se presenten con menos frecuencia.</w:t>
-      </w:r>
-    </w:p>
-    <w:p>
-      <w:pPr>
-        <w:pStyle w:val="ListParagraph"/>
-        <w:numPr>
-          <w:ilvl w:val="0"/>
-          <w:numId w:val="2"/>
-        </w:numPr>
-        <w:spacing w:after="80"/>
-      </w:pPr>
-      <w:r>
-        <w:rPr>
-          <w:b/>
-          <w:bCs/>
-        </w:rPr>
-        <w:t xml:space="preserve">Los problemas más mencionados:</w:t>
-      </w:r>
-      <w:r>
-        <w:t xml:space="preserve"> caídas y lentitud del sistema, reversas que no se aplican, tarjetas (plásticos) que fallan, y la atención de reclamos y fraudes.</w:t>
-      </w:r>
     </w:p>
     <w:p>
       <w:pPr>
@@ -5726,7 +5402,7 @@
         <w:jc w:val="both"/>
       </w:pPr>
       <w:r>
-        <w:t xml:space="preserve">De los 17 colaboradores, 14 reportaron problemas y 3 indicaron no tener inconvenientes ("Todo bien", "sin inconvenientes" y "siempre recibo ayuda"). A continuación se presentan los problemas reportados, agrupados por tema y citando lo que escribieron los colaboradores.</w:t>
+        <w:t xml:space="preserve">De los 17 colaboradores, 14 reportaron problemas y 3 indicaron no tener inconvenientes ("Todo bien", "sin inconvenientes" y "siempre recibo ayuda"). Sus comentarios se agrupan por tema y se citan tal como fueron escritos.</w:t>
       </w:r>
     </w:p>
     <w:p>
@@ -5960,7 +5636,7 @@
         <w:jc w:val="both"/>
       </w:pPr>
       <w:r>
-        <w:t xml:space="preserve">Los colaboradores también hicieron las siguientes sugerencias:</w:t>
+        <w:t xml:space="preserve">Además de los problemas, los colaboradores propusieron:</w:t>
       </w:r>
     </w:p>
     <w:p>
@@ -6020,54 +5696,11 @@
     </w:p>
     <w:p>
       <w:pPr>
-        <w:pStyle w:val="ListParagraph"/>
-        <w:numPr>
-          <w:ilvl w:val="0"/>
-          <w:numId w:val="4"/>
-        </w:numPr>
-        <w:spacing w:after="80"/>
+        <w:spacing w:after="160"/>
+        <w:jc w:val="both"/>
       </w:pPr>
       <w:r>
-        <w:t xml:space="preserve">El personal está conforme con el servicio de Evertec en términos generales: 14 de 17 colaboradores le dieron nota de 4 y ninguno le dio una nota menor a 3.</w:t>
-      </w:r>
-    </w:p>
-    <w:p>
-      <w:pPr>
-        <w:pStyle w:val="ListParagraph"/>
-        <w:numPr>
-          <w:ilvl w:val="0"/>
-          <w:numId w:val="4"/>
-        </w:numPr>
-        <w:spacing w:after="80"/>
-      </w:pPr>
-      <w:r>
-        <w:t xml:space="preserve">Evertec atiende a tiempo: 15 de 17 colaboradores así lo indican.</w:t>
-      </w:r>
-    </w:p>
-    <w:p>
-      <w:pPr>
-        <w:pStyle w:val="ListParagraph"/>
-        <w:numPr>
-          <w:ilvl w:val="0"/>
-          <w:numId w:val="4"/>
-        </w:numPr>
-        <w:spacing w:after="80"/>
-      </w:pPr>
-      <w:r>
-        <w:t xml:space="preserve">El punto más débil es la solución de los problemas: 9 de 17 colaboradores consideran que resolverlos es "Regular" o "Difícil".</w:t>
-      </w:r>
-    </w:p>
-    <w:p>
-      <w:pPr>
-        <w:pStyle w:val="ListParagraph"/>
-        <w:numPr>
-          <w:ilvl w:val="0"/>
-          <w:numId w:val="4"/>
-        </w:numPr>
-        <w:spacing w:after="80"/>
-      </w:pPr>
-      <w:r>
-        <w:t xml:space="preserve">Los problemas más reportados son la estabilidad y lentitud del sistema, las reversas, los plásticos, la falta de detalle en las notas de crédito, y la atención de fraudes, contracargos y promociones.</w:t>
+        <w:t xml:space="preserve">La atención de Evertec llega a tiempo y el servicio recibe una buena nota general; sin embargo, la solución de los casos no avanza al mismo ritmo. La mayor parte de los problemas reportados tiene que ver con el funcionamiento del sistema y el procesamiento de transacciones, lo que afecta directamente la atención a los asociados.</w:t>
       </w:r>
     </w:p>
     <w:sectPr>
@@ -6316,12 +5949,6 @@
       <w:startOverride w:val="1"/>
     </w:lvlOverride>
   </w:num>
-  <w:num w:numId="4">
-    <w:abstractNumId w:val="3"/>
-    <w:lvlOverride w:ilvl="0">
-      <w:startOverride w:val="1"/>
-    </w:lvlOverride>
-  </w:num>
 </w:numbering>
 </file>
 

</xml_diff>